<commit_message>
Plantilla F-TH-028: tabla del formato original con los recuadros de elementos de trabajo (X dentro del campo) y celdas sin controles de contenido
</commit_message>
<xml_diff>
--- a/COPIA_F-TH-028_REQUISICIÓN_DE_PERSONAL _V03.docx
+++ b/COPIA_F-TH-028_REQUISICIÓN_DE_PERSONAL _V03.docx
@@ -9,51 +9,53 @@
     <w:tbl>
       <w:tblPr>
         <w:tblStyle w:val="Tablaconcuadrcula"/>
-        <w:tblW w:w="11228" w:type="dxa"/>
+        <w:tblW w:w="11086" w:type="dxa"/>
         <w:tblInd w:w="-885" w:type="dxa"/>
         <w:tblLayout w:type="fixed"/>
         <w:tblLook w:val="04A0" w:firstRow="1" w:lastRow="0" w:firstColumn="1" w:lastColumn="0" w:noHBand="0" w:noVBand="1"/>
       </w:tblPr>
       <w:tblGrid>
-        <w:gridCol w:w="985"/>
-        <w:gridCol w:w="460"/>
-        <w:gridCol w:w="132"/>
-        <w:gridCol w:w="245"/>
-        <w:gridCol w:w="889"/>
-        <w:gridCol w:w="510"/>
-        <w:gridCol w:w="57"/>
-        <w:gridCol w:w="232"/>
-        <w:gridCol w:w="619"/>
-        <w:gridCol w:w="567"/>
-        <w:gridCol w:w="9"/>
-        <w:gridCol w:w="558"/>
-        <w:gridCol w:w="141"/>
-        <w:gridCol w:w="576"/>
-        <w:gridCol w:w="122"/>
+        <w:gridCol w:w="989"/>
+        <w:gridCol w:w="281"/>
+        <w:gridCol w:w="564"/>
+        <w:gridCol w:w="1023"/>
+        <w:gridCol w:w="236"/>
+        <w:gridCol w:w="140"/>
+        <w:gridCol w:w="289"/>
+        <w:gridCol w:w="760"/>
+        <w:gridCol w:w="41"/>
+        <w:gridCol w:w="239"/>
+        <w:gridCol w:w="713"/>
+        <w:gridCol w:w="324"/>
+        <w:gridCol w:w="236"/>
+        <w:gridCol w:w="239"/>
+        <w:gridCol w:w="40"/>
         <w:gridCol w:w="78"/>
-        <w:gridCol w:w="367"/>
-        <w:gridCol w:w="406"/>
-        <w:gridCol w:w="161"/>
-        <w:gridCol w:w="142"/>
-        <w:gridCol w:w="425"/>
-        <w:gridCol w:w="133"/>
-        <w:gridCol w:w="576"/>
-        <w:gridCol w:w="428"/>
-        <w:gridCol w:w="142"/>
-        <w:gridCol w:w="272"/>
-        <w:gridCol w:w="150"/>
-        <w:gridCol w:w="145"/>
-        <w:gridCol w:w="281"/>
-        <w:gridCol w:w="67"/>
-        <w:gridCol w:w="219"/>
-        <w:gridCol w:w="17"/>
-        <w:gridCol w:w="1117"/>
+        <w:gridCol w:w="165"/>
+        <w:gridCol w:w="377"/>
+        <w:gridCol w:w="231"/>
+        <w:gridCol w:w="52"/>
+        <w:gridCol w:w="191"/>
+        <w:gridCol w:w="283"/>
+        <w:gridCol w:w="283"/>
+        <w:gridCol w:w="330"/>
+        <w:gridCol w:w="144"/>
+        <w:gridCol w:w="330"/>
+        <w:gridCol w:w="93"/>
+        <w:gridCol w:w="96"/>
+        <w:gridCol w:w="377"/>
+        <w:gridCol w:w="97"/>
+        <w:gridCol w:w="380"/>
+        <w:gridCol w:w="184"/>
+        <w:gridCol w:w="76"/>
+        <w:gridCol w:w="236"/>
+        <w:gridCol w:w="969"/>
       </w:tblGrid>
       <w:tr>
         <w:tc>
           <w:tcPr>
-            <w:tcW w:w="11228" w:type="dxa"/>
-            <w:gridSpan w:val="33"/>
+            <w:tcW w:w="11086" w:type="dxa"/>
+            <w:gridSpan w:val="35"/>
             <w:shd w:val="clear" w:color="auto" w:fill="2E74B5" w:themeFill="accent1" w:themeFillShade="BF"/>
             <w:vAlign w:val="center"/>
           </w:tcPr>
@@ -83,8 +85,8 @@
       <w:tr>
         <w:tc>
           <w:tcPr>
-            <w:tcW w:w="2711" w:type="dxa"/>
-            <w:gridSpan w:val="5"/>
+            <w:tcW w:w="2857" w:type="dxa"/>
+            <w:gridSpan w:val="4"/>
             <w:shd w:val="clear" w:color="auto" w:fill="DEEAF6" w:themeFill="accent1" w:themeFillTint="33"/>
             <w:vAlign w:val="center"/>
           </w:tcPr>
@@ -111,7 +113,7 @@
         </w:tc>
         <w:tc>
           <w:tcPr>
-            <w:tcW w:w="2552" w:type="dxa"/>
+            <w:tcW w:w="2418" w:type="dxa"/>
             <w:gridSpan w:val="7"/>
             <w:shd w:val="clear" w:color="auto" w:fill="DEEAF6" w:themeFill="accent1" w:themeFillTint="33"/>
             <w:vAlign w:val="center"/>
@@ -139,8 +141,8 @@
         </w:tc>
         <w:tc>
           <w:tcPr>
-            <w:tcW w:w="5965" w:type="dxa"/>
-            <w:gridSpan w:val="21"/>
+            <w:tcW w:w="5811" w:type="dxa"/>
+            <w:gridSpan w:val="24"/>
             <w:shd w:val="clear" w:color="auto" w:fill="DEEAF6" w:themeFill="accent1" w:themeFillTint="33"/>
             <w:vAlign w:val="center"/>
           </w:tcPr>
@@ -172,8 +174,8 @@
         </w:trPr>
         <w:tc>
           <w:tcPr>
-            <w:tcW w:w="2711" w:type="dxa"/>
-            <w:gridSpan w:val="5"/>
+            <w:tcW w:w="2857" w:type="dxa"/>
+            <w:gridSpan w:val="4"/>
             <w:vAlign w:val="center"/>
           </w:tcPr>
           <w:p>
@@ -223,7 +225,7 @@
         </w:tc>
         <w:tc>
           <w:tcPr>
-            <w:tcW w:w="2552" w:type="dxa"/>
+            <w:tcW w:w="2418" w:type="dxa"/>
             <w:gridSpan w:val="7"/>
             <w:vAlign w:val="center"/>
           </w:tcPr>
@@ -264,8 +266,8 @@
         </w:tc>
         <w:tc>
           <w:tcPr>
-            <w:tcW w:w="5965" w:type="dxa"/>
-            <w:gridSpan w:val="21"/>
+            <w:tcW w:w="5811" w:type="dxa"/>
+            <w:gridSpan w:val="24"/>
             <w:vAlign w:val="center"/>
           </w:tcPr>
           <w:p>
@@ -309,7 +311,7 @@
       <w:tr>
         <w:tc>
           <w:tcPr>
-            <w:tcW w:w="3221" w:type="dxa"/>
+            <w:tcW w:w="3233" w:type="dxa"/>
             <w:gridSpan w:val="6"/>
             <w:shd w:val="clear" w:color="auto" w:fill="DEEAF6" w:themeFill="accent1" w:themeFillTint="33"/>
           </w:tcPr>
@@ -372,8 +374,8 @@
         </w:tc>
         <w:tc>
           <w:tcPr>
-            <w:tcW w:w="2210" w:type="dxa"/>
-            <w:gridSpan w:val="7"/>
+            <w:tcW w:w="1912" w:type="dxa"/>
+            <w:gridSpan w:val="8"/>
             <w:shd w:val="clear" w:color="auto" w:fill="DEEAF6" w:themeFill="accent1" w:themeFillTint="33"/>
           </w:tcPr>
           <w:p>
@@ -399,8 +401,8 @@
         </w:tc>
         <w:tc>
           <w:tcPr>
-            <w:tcW w:w="2838" w:type="dxa"/>
-            <w:gridSpan w:val="10"/>
+            <w:tcW w:w="2982" w:type="dxa"/>
+            <w:gridSpan w:val="11"/>
             <w:shd w:val="clear" w:color="auto" w:fill="DEEAF6" w:themeFill="accent1" w:themeFillTint="33"/>
           </w:tcPr>
           <w:p>
@@ -431,7 +433,7 @@
         </w:trPr>
         <w:tc>
           <w:tcPr>
-            <w:tcW w:w="3221" w:type="dxa"/>
+            <w:tcW w:w="3233" w:type="dxa"/>
             <w:gridSpan w:val="6"/>
             <w:vAlign w:val="center"/>
           </w:tcPr>
@@ -515,8 +517,8 @@
         </w:tc>
         <w:tc>
           <w:tcPr>
-            <w:tcW w:w="2210" w:type="dxa"/>
-            <w:gridSpan w:val="7"/>
+            <w:tcW w:w="1912" w:type="dxa"/>
+            <w:gridSpan w:val="8"/>
             <w:vAlign w:val="center"/>
           </w:tcPr>
           <w:p>
@@ -574,8 +576,8 @@
         </w:tc>
         <w:tc>
           <w:tcPr>
-            <w:tcW w:w="2838" w:type="dxa"/>
-            <w:gridSpan w:val="10"/>
+            <w:tcW w:w="2982" w:type="dxa"/>
+            <w:gridSpan w:val="11"/>
             <w:vAlign w:val="center"/>
           </w:tcPr>
           <w:p>
@@ -603,7 +605,7 @@
         </w:trPr>
         <w:tc>
           <w:tcPr>
-            <w:tcW w:w="3221" w:type="dxa"/>
+            <w:tcW w:w="3233" w:type="dxa"/>
             <w:gridSpan w:val="6"/>
             <w:shd w:val="clear" w:color="auto" w:fill="2E74B5" w:themeFill="accent1" w:themeFillShade="BF"/>
             <w:vAlign w:val="center"/>
@@ -657,8 +659,8 @@
         </w:tc>
         <w:tc>
           <w:tcPr>
-            <w:tcW w:w="5048" w:type="dxa"/>
-            <w:gridSpan w:val="17"/>
+            <w:tcW w:w="4894" w:type="dxa"/>
+            <w:gridSpan w:val="19"/>
             <w:shd w:val="clear" w:color="auto" w:fill="2E74B5" w:themeFill="accent1" w:themeFillShade="BF"/>
             <w:vAlign w:val="center"/>
           </w:tcPr>
@@ -689,7 +691,7 @@
         </w:trPr>
         <w:tc>
           <w:tcPr>
-            <w:tcW w:w="3221" w:type="dxa"/>
+            <w:tcW w:w="3233" w:type="dxa"/>
             <w:gridSpan w:val="6"/>
             <w:vAlign w:val="center"/>
           </w:tcPr>
@@ -810,8 +812,8 @@
         </w:tc>
         <w:tc>
           <w:tcPr>
-            <w:tcW w:w="5048" w:type="dxa"/>
-            <w:gridSpan w:val="17"/>
+            <w:tcW w:w="4894" w:type="dxa"/>
+            <w:gridSpan w:val="19"/>
             <w:vAlign w:val="center"/>
           </w:tcPr>
           <w:p>
@@ -927,8 +929,8 @@
         </w:trPr>
         <w:tc>
           <w:tcPr>
-            <w:tcW w:w="1822" w:type="dxa"/>
-            <w:gridSpan w:val="4"/>
+            <w:tcW w:w="1834" w:type="dxa"/>
+            <w:gridSpan w:val="3"/>
             <w:shd w:val="clear" w:color="auto" w:fill="2E74B5" w:themeFill="accent1" w:themeFillShade="BF"/>
             <w:vAlign w:val="center"/>
           </w:tcPr>
@@ -957,8 +959,8 @@
         </w:tc>
         <w:tc>
           <w:tcPr>
-            <w:tcW w:w="9406" w:type="dxa"/>
-            <w:gridSpan w:val="29"/>
+            <w:tcW w:w="9252" w:type="dxa"/>
+            <w:gridSpan w:val="32"/>
             <w:tcBorders>
               <w:right w:val="single" w:sz="4" w:space="0" w:color="auto"/>
             </w:tcBorders>
@@ -1005,8 +1007,8 @@
         </w:trPr>
         <w:tc>
           <w:tcPr>
-            <w:tcW w:w="1822" w:type="dxa"/>
-            <w:gridSpan w:val="4"/>
+            <w:tcW w:w="1834" w:type="dxa"/>
+            <w:gridSpan w:val="3"/>
             <w:shd w:val="clear" w:color="auto" w:fill="2E74B5" w:themeFill="accent1" w:themeFillShade="BF"/>
             <w:vAlign w:val="center"/>
           </w:tcPr>
@@ -1046,7 +1048,7 @@
         <w:tc>
           <w:tcPr>
             <w:tcW w:w="4280" w:type="dxa"/>
-            <w:gridSpan w:val="11"/>
+            <w:gridSpan w:val="12"/>
             <w:vAlign w:val="center"/>
           </w:tcPr>
           <w:p>
@@ -1085,8 +1087,8 @@
         </w:tc>
         <w:tc>
           <w:tcPr>
-            <w:tcW w:w="2288" w:type="dxa"/>
-            <w:gridSpan w:val="8"/>
+            <w:tcW w:w="1990" w:type="dxa"/>
+            <w:gridSpan w:val="9"/>
             <w:tcBorders>
               <w:right w:val="single" w:sz="4" w:space="0" w:color="auto"/>
             </w:tcBorders>
@@ -1139,8 +1141,8 @@
         </w:tc>
         <w:tc>
           <w:tcPr>
-            <w:tcW w:w="992" w:type="dxa"/>
-            <w:gridSpan w:val="4"/>
+            <w:tcW w:w="567" w:type="dxa"/>
+            <w:gridSpan w:val="3"/>
             <w:tcBorders>
               <w:top w:val="single" w:sz="4" w:space="0" w:color="auto"/>
               <w:left w:val="single" w:sz="4" w:space="0" w:color="auto"/>
@@ -1151,12 +1153,21 @@
           </w:tcPr>
           <w:p>
             <w:pPr>
-              <w:rPr>
-                <w:rFonts w:ascii="Arial" w:hAnsi="Arial" w:cs="Arial"/>
-                <w:sz w:val="18"/>
-                <w:szCs w:val="18"/>
-              </w:rPr>
-            </w:pPr>
+              <w:jc w:val="center"/>
+              <w:rPr>
+                <w:rFonts w:ascii="Arial" w:hAnsi="Arial" w:cs="Arial"/>
+                <w:sz w:val="18"/>
+                <w:szCs w:val="18"/>
+              </w:rPr>
+            </w:pPr>
+            <w:r>
+              <w:rPr>
+                <w:rFonts w:ascii="Arial" w:hAnsi="Arial" w:cs="Arial"/>
+                <w:sz w:val="18"/>
+                <w:szCs w:val="18"/>
+              </w:rPr>
+              <w:t xml:space="preserve"> </w:t>
+            </w:r>
             <w:r>
               <w:rPr>
                 <w:rFonts w:ascii="Arial" w:hAnsi="Arial" w:cs="Arial"/>
@@ -1171,40 +1182,14 @@
                 <w:sz w:val="18"/>
                 <w:szCs w:val="18"/>
               </w:rPr>
-              <w:t xml:space="preserve">   </w:t>
-            </w:r>
-            <w:r>
-              <w:rPr>
-                <w:rFonts w:ascii="Arial" w:hAnsi="Arial" w:cs="Arial"/>
-                <w:sz w:val="18"/>
-                <w:szCs w:val="18"/>
-              </w:rPr>
-              <w:t>{</w:t>
-            </w:r>
-            <w:proofErr w:type="spellStart"/>
-            <w:r>
-              <w:rPr>
-                <w:rFonts w:ascii="Arial" w:hAnsi="Arial" w:cs="Arial"/>
-                <w:sz w:val="18"/>
-                <w:szCs w:val="18"/>
-              </w:rPr>
-              <w:t>xsi</w:t>
-            </w:r>
-            <w:proofErr w:type="spellEnd"/>
-            <w:r>
-              <w:rPr>
-                <w:rFonts w:ascii="Arial" w:hAnsi="Arial" w:cs="Arial"/>
-                <w:sz w:val="18"/>
-                <w:szCs w:val="18"/>
-              </w:rPr>
-              <w:t>}</w:t>
-            </w:r>
-          </w:p>
-        </w:tc>
-        <w:tc>
-          <w:tcPr>
-            <w:tcW w:w="493" w:type="dxa"/>
-            <w:gridSpan w:val="3"/>
+              <w:t xml:space="preserve"> </w:t>
+            </w:r>
+          </w:p>
+        </w:tc>
+        <w:tc>
+          <w:tcPr>
+            <w:tcW w:w="1210" w:type="dxa"/>
+            <w:gridSpan w:val="6"/>
             <w:tcBorders>
               <w:top w:val="single" w:sz="4" w:space="0" w:color="auto"/>
               <w:left w:val="nil"/>
@@ -1215,27 +1200,41 @@
           </w:tcPr>
           <w:p>
             <w:pPr>
-              <w:jc w:val="center"/>
-              <w:rPr>
-                <w:rFonts w:ascii="Arial" w:hAnsi="Arial" w:cs="Arial"/>
-                <w:sz w:val="18"/>
-                <w:szCs w:val="18"/>
-              </w:rPr>
-            </w:pPr>
-            <w:r>
-              <w:rPr>
-                <w:rFonts w:ascii="Arial" w:hAnsi="Arial" w:cs="Arial"/>
-                <w:sz w:val="18"/>
-                <w:szCs w:val="18"/>
-              </w:rPr>
-              <w:t>NO</w:t>
+              <w:rPr>
+                <w:rFonts w:ascii="Arial" w:hAnsi="Arial" w:cs="Arial"/>
+                <w:sz w:val="18"/>
+                <w:szCs w:val="18"/>
+              </w:rPr>
+            </w:pPr>
+            <w:r>
+              <w:rPr>
+                <w:rFonts w:ascii="Arial" w:hAnsi="Arial" w:cs="Arial"/>
+                <w:sz w:val="18"/>
+                <w:szCs w:val="18"/>
+              </w:rPr>
+              <w:t>{xsi}</w:t>
+            </w:r>
+            <w:r>
+              <w:rPr>
+                <w:rFonts w:ascii="Arial" w:hAnsi="Arial" w:cs="Arial"/>
+                <w:sz w:val="18"/>
+                <w:szCs w:val="18"/>
+              </w:rPr>
+              <w:t xml:space="preserve">     NO  </w:t>
+            </w:r>
+            <w:r>
+              <w:rPr>
+                <w:rFonts w:ascii="Arial" w:hAnsi="Arial" w:cs="Arial"/>
+                <w:sz w:val="18"/>
+                <w:szCs w:val="18"/>
+              </w:rPr>
+              <w:t>{xno}</w:t>
             </w:r>
           </w:p>
         </w:tc>
         <w:tc>
           <w:tcPr>
             <w:tcW w:w="236" w:type="dxa"/>
-            <w:gridSpan w:val="2"/>
             <w:tcBorders>
               <w:top w:val="single" w:sz="4" w:space="0" w:color="auto"/>
               <w:left w:val="nil"/>
@@ -1256,7 +1255,7 @@
         </w:tc>
         <w:tc>
           <w:tcPr>
-            <w:tcW w:w="1117" w:type="dxa"/>
+            <w:tcW w:w="969" w:type="dxa"/>
             <w:tcBorders>
               <w:top w:val="single" w:sz="4" w:space="0" w:color="auto"/>
               <w:left w:val="nil"/>
@@ -1273,32 +1272,6 @@
                 <w:szCs w:val="18"/>
               </w:rPr>
             </w:pPr>
-            <w:r>
-              <w:rPr>
-                <w:rFonts w:ascii="Arial" w:hAnsi="Arial" w:cs="Arial"/>
-                <w:sz w:val="18"/>
-                <w:szCs w:val="18"/>
-              </w:rPr>
-              <w:t>{</w:t>
-            </w:r>
-            <w:proofErr w:type="spellStart"/>
-            <w:r>
-              <w:rPr>
-                <w:rFonts w:ascii="Arial" w:hAnsi="Arial" w:cs="Arial"/>
-                <w:sz w:val="18"/>
-                <w:szCs w:val="18"/>
-              </w:rPr>
-              <w:t>xno</w:t>
-            </w:r>
-            <w:proofErr w:type="spellEnd"/>
-            <w:r>
-              <w:rPr>
-                <w:rFonts w:ascii="Arial" w:hAnsi="Arial" w:cs="Arial"/>
-                <w:sz w:val="18"/>
-                <w:szCs w:val="18"/>
-              </w:rPr>
-              <w:t>}</w:t>
-            </w:r>
           </w:p>
         </w:tc>
       </w:tr>
@@ -1308,8 +1281,8 @@
         </w:trPr>
         <w:tc>
           <w:tcPr>
-            <w:tcW w:w="11228" w:type="dxa"/>
-            <w:gridSpan w:val="33"/>
+            <w:tcW w:w="11086" w:type="dxa"/>
+            <w:gridSpan w:val="35"/>
             <w:shd w:val="clear" w:color="auto" w:fill="2E74B5" w:themeFill="accent1" w:themeFillShade="BF"/>
             <w:vAlign w:val="center"/>
           </w:tcPr>
@@ -1352,8 +1325,8 @@
         </w:trPr>
         <w:tc>
           <w:tcPr>
-            <w:tcW w:w="11228" w:type="dxa"/>
-            <w:gridSpan w:val="33"/>
+            <w:tcW w:w="11086" w:type="dxa"/>
+            <w:gridSpan w:val="35"/>
           </w:tcPr>
           <w:p>
             <w:pPr>
@@ -1398,8 +1371,8 @@
         </w:trPr>
         <w:tc>
           <w:tcPr>
-            <w:tcW w:w="11228" w:type="dxa"/>
-            <w:gridSpan w:val="33"/>
+            <w:tcW w:w="11086" w:type="dxa"/>
+            <w:gridSpan w:val="35"/>
             <w:shd w:val="clear" w:color="auto" w:fill="2E74B5" w:themeFill="accent1" w:themeFillShade="BF"/>
             <w:vAlign w:val="center"/>
           </w:tcPr>
@@ -1442,8 +1415,8 @@
         </w:trPr>
         <w:tc>
           <w:tcPr>
-            <w:tcW w:w="11228" w:type="dxa"/>
-            <w:gridSpan w:val="33"/>
+            <w:tcW w:w="11086" w:type="dxa"/>
+            <w:gridSpan w:val="35"/>
           </w:tcPr>
           <w:p>
             <w:pPr>
@@ -1467,8 +1440,8 @@
       <w:tr>
         <w:tc>
           <w:tcPr>
-            <w:tcW w:w="11228" w:type="dxa"/>
-            <w:gridSpan w:val="33"/>
+            <w:tcW w:w="11086" w:type="dxa"/>
+            <w:gridSpan w:val="35"/>
             <w:tcBorders>
               <w:bottom w:val="single" w:sz="4" w:space="0" w:color="auto"/>
             </w:tcBorders>
@@ -1485,16 +1458,6 @@
                 <w:szCs w:val="18"/>
               </w:rPr>
             </w:pPr>
-            <w:r>
-              <w:rPr>
-                <w:rFonts w:ascii="Arial" w:hAnsi="Arial" w:cs="Arial"/>
-                <w:b/>
-                <w:color w:val="FFFFFF" w:themeColor="background1"/>
-                <w:sz w:val="18"/>
-                <w:szCs w:val="18"/>
-              </w:rPr>
-              <w:t>A</w:t>
-            </w:r>
             <w:r>
               <w:rPr>
                 <w:rFonts w:ascii="Arial" w:hAnsi="Arial" w:cs="Arial"/>
@@ -1514,7 +1477,7 @@
         </w:trPr>
         <w:tc>
           <w:tcPr>
-            <w:tcW w:w="985" w:type="dxa"/>
+            <w:tcW w:w="989" w:type="dxa"/>
             <w:tcBorders>
               <w:top w:val="single" w:sz="4" w:space="0" w:color="auto"/>
               <w:left w:val="single" w:sz="4" w:space="0" w:color="auto"/>
@@ -1544,7 +1507,98 @@
         </w:tc>
         <w:tc>
           <w:tcPr>
-            <w:tcW w:w="592" w:type="dxa"/>
+            <w:tcW w:w="281" w:type="dxa"/>
+            <w:tcBorders>
+              <w:top w:val="single" w:sz="4" w:space="0" w:color="auto"/>
+              <w:left w:val="nil"/>
+              <w:bottom w:val="nil"/>
+              <w:right w:val="nil"/>
+            </w:tcBorders>
+            <w:vAlign w:val="center"/>
+          </w:tcPr>
+          <w:p>
+            <w:pPr>
+              <w:ind w:left="-91"/>
+              <w:rPr>
+                <w:rFonts w:ascii="Arial" w:hAnsi="Arial" w:cs="Arial"/>
+                <w:sz w:val="18"/>
+                <w:szCs w:val="18"/>
+              </w:rPr>
+            </w:pPr>
+            <w:r>
+              <w:rPr>
+                <w:rFonts w:ascii="Arial" w:hAnsi="Arial" w:cs="Arial"/>
+                <w:b/>
+                <w:sz w:val="24"/>
+                <w:szCs w:val="24"/>
+                <w:bdr w:val="single" w:sz="4" w:space="0" w:color="auto"/>
+              </w:rPr>
+              <w:fldChar w:fldCharType="begin">
+                <w:ffData>
+                  <w:name w:val=""/>
+                  <w:enabled/>
+                  <w:calcOnExit w:val="0"/>
+                  <w:textInput>
+                    <w:maxLength w:val="1"/>
+                    <w:format w:val="UPPERCASE"/>
+                  </w:textInput>
+                </w:ffData>
+              </w:fldChar>
+            </w:r>
+            <w:r>
+              <w:rPr>
+                <w:rFonts w:ascii="Arial" w:hAnsi="Arial" w:cs="Arial"/>
+                <w:b/>
+                <w:sz w:val="24"/>
+                <w:szCs w:val="24"/>
+                <w:bdr w:val="single" w:sz="4" w:space="0" w:color="auto"/>
+              </w:rPr>
+              <w:instrText xml:space="preserve"> FORMTEXT </w:instrText>
+            </w:r>
+            <w:r>
+              <w:rPr>
+                <w:rFonts w:ascii="Arial" w:hAnsi="Arial" w:cs="Arial"/>
+                <w:b/>
+                <w:sz w:val="24"/>
+                <w:szCs w:val="24"/>
+                <w:bdr w:val="single" w:sz="4" w:space="0" w:color="auto"/>
+              </w:rPr>
+            </w:r>
+            <w:r>
+              <w:rPr>
+                <w:rFonts w:ascii="Arial" w:hAnsi="Arial" w:cs="Arial"/>
+                <w:b/>
+                <w:sz w:val="24"/>
+                <w:szCs w:val="24"/>
+                <w:bdr w:val="single" w:sz="4" w:space="0" w:color="auto"/>
+              </w:rPr>
+              <w:fldChar w:fldCharType="separate"/>
+            </w:r>
+            <w:r>
+              <w:rPr>
+                <w:rFonts w:ascii="Arial" w:hAnsi="Arial" w:cs="Arial"/>
+                <w:b/>
+                <w:sz w:val="24"/>
+                <w:szCs w:val="24"/>
+                <w:bdr w:val="single" w:sz="4" w:space="0" w:color="auto"/>
+              </w:rPr>
+              <w:t>{a}</w:t>
+            </w:r>
+            <w:r>
+              <w:rPr>
+                <w:rFonts w:ascii="Arial" w:hAnsi="Arial" w:cs="Arial"/>
+                <w:b/>
+                <w:sz w:val="24"/>
+                <w:szCs w:val="24"/>
+                <w:bdr w:val="single" w:sz="4" w:space="0" w:color="auto"/>
+              </w:rPr>
+              <w:fldChar w:fldCharType="end"/>
+            </w:r>
+          </w:p>
+        </w:tc>
+        <w:tc>
+          <w:tcPr>
+            <w:tcW w:w="1587" w:type="dxa"/>
             <w:gridSpan w:val="2"/>
             <w:tcBorders>
               <w:top w:val="single" w:sz="4" w:space="0" w:color="auto"/>
@@ -1556,26 +1610,239 @@
           </w:tcPr>
           <w:p>
             <w:pPr>
-              <w:ind w:left="-91"/>
-              <w:rPr>
-                <w:rFonts w:ascii="Arial" w:hAnsi="Arial" w:cs="Arial"/>
-                <w:sz w:val="18"/>
-                <w:szCs w:val="18"/>
-              </w:rPr>
-            </w:pPr>
-            <w:r>
-              <w:rPr>
-                <w:rFonts w:ascii="Arial" w:hAnsi="Arial" w:cs="Arial"/>
-                <w:sz w:val="18"/>
-                <w:szCs w:val="18"/>
-              </w:rPr>
-              <w:t>{a}</w:t>
-            </w:r>
-          </w:p>
-        </w:tc>
-        <w:tc>
-          <w:tcPr>
-            <w:tcW w:w="1134" w:type="dxa"/>
+              <w:jc w:val="center"/>
+              <w:rPr>
+                <w:rFonts w:ascii="Arial" w:hAnsi="Arial" w:cs="Arial"/>
+                <w:sz w:val="14"/>
+                <w:szCs w:val="14"/>
+              </w:rPr>
+            </w:pPr>
+            <w:r>
+              <w:rPr>
+                <w:rFonts w:ascii="Arial" w:hAnsi="Arial" w:cs="Arial"/>
+                <w:sz w:val="14"/>
+                <w:szCs w:val="14"/>
+              </w:rPr>
+              <w:t>Computar Portátil</w:t>
+            </w:r>
+          </w:p>
+        </w:tc>
+        <w:tc>
+          <w:tcPr>
+            <w:tcW w:w="236" w:type="dxa"/>
+            <w:tcBorders>
+              <w:top w:val="single" w:sz="4" w:space="0" w:color="auto"/>
+              <w:left w:val="nil"/>
+              <w:bottom w:val="nil"/>
+              <w:right w:val="nil"/>
+            </w:tcBorders>
+            <w:vAlign w:val="center"/>
+          </w:tcPr>
+          <w:p>
+            <w:pPr>
+              <w:ind w:left="-77"/>
+              <w:rPr>
+                <w:rFonts w:ascii="Arial" w:hAnsi="Arial" w:cs="Arial"/>
+                <w:sz w:val="18"/>
+                <w:szCs w:val="18"/>
+              </w:rPr>
+            </w:pPr>
+            <w:r>
+              <w:rPr>
+                <w:rFonts w:ascii="Arial" w:hAnsi="Arial" w:cs="Arial"/>
+                <w:b/>
+                <w:sz w:val="24"/>
+                <w:szCs w:val="24"/>
+                <w:bdr w:val="single" w:sz="4" w:space="0" w:color="auto"/>
+              </w:rPr>
+              <w:fldChar w:fldCharType="begin">
+                <w:ffData>
+                  <w:name w:val=""/>
+                  <w:enabled/>
+                  <w:calcOnExit w:val="0"/>
+                  <w:textInput>
+                    <w:maxLength w:val="1"/>
+                    <w:format w:val="UPPERCASE"/>
+                  </w:textInput>
+                </w:ffData>
+              </w:fldChar>
+            </w:r>
+            <w:r>
+              <w:rPr>
+                <w:rFonts w:ascii="Arial" w:hAnsi="Arial" w:cs="Arial"/>
+                <w:b/>
+                <w:sz w:val="24"/>
+                <w:szCs w:val="24"/>
+                <w:bdr w:val="single" w:sz="4" w:space="0" w:color="auto"/>
+              </w:rPr>
+              <w:instrText xml:space="preserve"> FORMTEXT </w:instrText>
+            </w:r>
+            <w:r>
+              <w:rPr>
+                <w:rFonts w:ascii="Arial" w:hAnsi="Arial" w:cs="Arial"/>
+                <w:b/>
+                <w:sz w:val="24"/>
+                <w:szCs w:val="24"/>
+                <w:bdr w:val="single" w:sz="4" w:space="0" w:color="auto"/>
+              </w:rPr>
+            </w:r>
+            <w:r>
+              <w:rPr>
+                <w:rFonts w:ascii="Arial" w:hAnsi="Arial" w:cs="Arial"/>
+                <w:b/>
+                <w:sz w:val="24"/>
+                <w:szCs w:val="24"/>
+                <w:bdr w:val="single" w:sz="4" w:space="0" w:color="auto"/>
+              </w:rPr>
+              <w:fldChar w:fldCharType="separate"/>
+            </w:r>
+            <w:r>
+              <w:rPr>
+                <w:rFonts w:ascii="Arial" w:hAnsi="Arial" w:cs="Arial"/>
+                <w:b/>
+                <w:sz w:val="24"/>
+                <w:szCs w:val="24"/>
+                <w:bdr w:val="single" w:sz="4" w:space="0" w:color="auto"/>
+              </w:rPr>
+              <w:t>{b}</w:t>
+            </w:r>
+            <w:r>
+              <w:rPr>
+                <w:rFonts w:ascii="Arial" w:hAnsi="Arial" w:cs="Arial"/>
+                <w:b/>
+                <w:sz w:val="24"/>
+                <w:szCs w:val="24"/>
+                <w:bdr w:val="single" w:sz="4" w:space="0" w:color="auto"/>
+              </w:rPr>
+              <w:fldChar w:fldCharType="end"/>
+            </w:r>
+          </w:p>
+        </w:tc>
+        <w:tc>
+          <w:tcPr>
+            <w:tcW w:w="1230" w:type="dxa"/>
+            <w:gridSpan w:val="4"/>
+            <w:tcBorders>
+              <w:top w:val="single" w:sz="4" w:space="0" w:color="auto"/>
+              <w:left w:val="nil"/>
+              <w:bottom w:val="nil"/>
+              <w:right w:val="nil"/>
+            </w:tcBorders>
+            <w:vAlign w:val="center"/>
+          </w:tcPr>
+          <w:p>
+            <w:pPr>
+              <w:jc w:val="center"/>
+              <w:rPr>
+                <w:rFonts w:ascii="Arial" w:hAnsi="Arial" w:cs="Arial"/>
+                <w:sz w:val="12"/>
+                <w:szCs w:val="12"/>
+              </w:rPr>
+            </w:pPr>
+            <w:r>
+              <w:rPr>
+                <w:rFonts w:ascii="Arial" w:hAnsi="Arial" w:cs="Arial"/>
+                <w:sz w:val="12"/>
+                <w:szCs w:val="12"/>
+              </w:rPr>
+              <w:t>Línea Telefónica</w:t>
+            </w:r>
+          </w:p>
+        </w:tc>
+        <w:tc>
+          <w:tcPr>
+            <w:tcW w:w="239" w:type="dxa"/>
+            <w:tcBorders>
+              <w:top w:val="single" w:sz="4" w:space="0" w:color="auto"/>
+              <w:left w:val="nil"/>
+              <w:bottom w:val="nil"/>
+              <w:right w:val="nil"/>
+            </w:tcBorders>
+            <w:vAlign w:val="center"/>
+          </w:tcPr>
+          <w:p>
+            <w:pPr>
+              <w:ind w:left="-108"/>
+              <w:rPr>
+                <w:rFonts w:ascii="Arial" w:hAnsi="Arial" w:cs="Arial"/>
+                <w:sz w:val="18"/>
+                <w:szCs w:val="18"/>
+              </w:rPr>
+            </w:pPr>
+            <w:r>
+              <w:rPr>
+                <w:rFonts w:ascii="Arial" w:hAnsi="Arial" w:cs="Arial"/>
+                <w:b/>
+                <w:sz w:val="24"/>
+                <w:szCs w:val="24"/>
+                <w:bdr w:val="single" w:sz="4" w:space="0" w:color="auto"/>
+              </w:rPr>
+              <w:fldChar w:fldCharType="begin">
+                <w:ffData>
+                  <w:name w:val=""/>
+                  <w:enabled/>
+                  <w:calcOnExit w:val="0"/>
+                  <w:textInput>
+                    <w:maxLength w:val="1"/>
+                    <w:format w:val="UPPERCASE"/>
+                  </w:textInput>
+                </w:ffData>
+              </w:fldChar>
+            </w:r>
+            <w:r>
+              <w:rPr>
+                <w:rFonts w:ascii="Arial" w:hAnsi="Arial" w:cs="Arial"/>
+                <w:b/>
+                <w:sz w:val="24"/>
+                <w:szCs w:val="24"/>
+                <w:bdr w:val="single" w:sz="4" w:space="0" w:color="auto"/>
+              </w:rPr>
+              <w:instrText xml:space="preserve"> FORMTEXT </w:instrText>
+            </w:r>
+            <w:r>
+              <w:rPr>
+                <w:rFonts w:ascii="Arial" w:hAnsi="Arial" w:cs="Arial"/>
+                <w:b/>
+                <w:sz w:val="24"/>
+                <w:szCs w:val="24"/>
+                <w:bdr w:val="single" w:sz="4" w:space="0" w:color="auto"/>
+              </w:rPr>
+            </w:r>
+            <w:r>
+              <w:rPr>
+                <w:rFonts w:ascii="Arial" w:hAnsi="Arial" w:cs="Arial"/>
+                <w:b/>
+                <w:sz w:val="24"/>
+                <w:szCs w:val="24"/>
+                <w:bdr w:val="single" w:sz="4" w:space="0" w:color="auto"/>
+              </w:rPr>
+              <w:fldChar w:fldCharType="separate"/>
+            </w:r>
+            <w:r>
+              <w:rPr>
+                <w:rFonts w:ascii="Arial" w:hAnsi="Arial" w:cs="Arial"/>
+                <w:b/>
+                <w:sz w:val="24"/>
+                <w:szCs w:val="24"/>
+                <w:bdr w:val="single" w:sz="4" w:space="0" w:color="auto"/>
+              </w:rPr>
+              <w:t>{c}</w:t>
+            </w:r>
+            <w:r>
+              <w:rPr>
+                <w:rFonts w:ascii="Arial" w:hAnsi="Arial" w:cs="Arial"/>
+                <w:b/>
+                <w:sz w:val="24"/>
+                <w:szCs w:val="24"/>
+                <w:bdr w:val="single" w:sz="4" w:space="0" w:color="auto"/>
+              </w:rPr>
+              <w:fldChar w:fldCharType="end"/>
+            </w:r>
+          </w:p>
+        </w:tc>
+        <w:tc>
+          <w:tcPr>
+            <w:tcW w:w="1037" w:type="dxa"/>
             <w:gridSpan w:val="2"/>
             <w:tcBorders>
               <w:top w:val="single" w:sz="4" w:space="0" w:color="auto"/>
@@ -1600,13 +1867,183 @@
                 <w:sz w:val="14"/>
                 <w:szCs w:val="14"/>
               </w:rPr>
-              <w:t>Computar Portátil</w:t>
-            </w:r>
-          </w:p>
-        </w:tc>
-        <w:tc>
-          <w:tcPr>
-            <w:tcW w:w="567" w:type="dxa"/>
+              <w:t>Puesto de</w:t>
+            </w:r>
+          </w:p>
+          <w:p>
+            <w:pPr>
+              <w:ind w:left="-249"/>
+              <w:jc w:val="center"/>
+              <w:rPr>
+                <w:rFonts w:ascii="Arial" w:hAnsi="Arial" w:cs="Arial"/>
+                <w:sz w:val="14"/>
+                <w:szCs w:val="14"/>
+              </w:rPr>
+            </w:pPr>
+            <w:r>
+              <w:rPr>
+                <w:rFonts w:ascii="Arial" w:hAnsi="Arial" w:cs="Arial"/>
+                <w:sz w:val="14"/>
+                <w:szCs w:val="14"/>
+              </w:rPr>
+              <w:t xml:space="preserve">     Trabajo</w:t>
+            </w:r>
+          </w:p>
+          <w:p>
+            <w:pPr>
+              <w:jc w:val="center"/>
+              <w:rPr>
+                <w:rFonts w:ascii="Arial" w:hAnsi="Arial" w:cs="Arial"/>
+                <w:sz w:val="14"/>
+                <w:szCs w:val="14"/>
+              </w:rPr>
+            </w:pPr>
+          </w:p>
+        </w:tc>
+        <w:tc>
+          <w:tcPr>
+            <w:tcW w:w="236" w:type="dxa"/>
+            <w:tcBorders>
+              <w:top w:val="single" w:sz="4" w:space="0" w:color="auto"/>
+              <w:left w:val="nil"/>
+              <w:bottom w:val="nil"/>
+              <w:right w:val="nil"/>
+            </w:tcBorders>
+            <w:vAlign w:val="center"/>
+          </w:tcPr>
+          <w:p>
+            <w:pPr>
+              <w:ind w:left="-108"/>
+              <w:rPr>
+                <w:rFonts w:ascii="Arial" w:hAnsi="Arial" w:cs="Arial"/>
+                <w:sz w:val="18"/>
+                <w:szCs w:val="18"/>
+              </w:rPr>
+            </w:pPr>
+            <w:r>
+              <w:rPr>
+                <w:rFonts w:ascii="Arial" w:hAnsi="Arial" w:cs="Arial"/>
+                <w:b/>
+                <w:sz w:val="24"/>
+                <w:szCs w:val="24"/>
+                <w:bdr w:val="single" w:sz="4" w:space="0" w:color="auto"/>
+              </w:rPr>
+              <w:fldChar w:fldCharType="begin">
+                <w:ffData>
+                  <w:name w:val=""/>
+                  <w:enabled/>
+                  <w:calcOnExit w:val="0"/>
+                  <w:textInput>
+                    <w:maxLength w:val="1"/>
+                    <w:format w:val="UPPERCASE"/>
+                  </w:textInput>
+                </w:ffData>
+              </w:fldChar>
+            </w:r>
+            <w:r>
+              <w:rPr>
+                <w:rFonts w:ascii="Arial" w:hAnsi="Arial" w:cs="Arial"/>
+                <w:b/>
+                <w:sz w:val="24"/>
+                <w:szCs w:val="24"/>
+                <w:bdr w:val="single" w:sz="4" w:space="0" w:color="auto"/>
+              </w:rPr>
+              <w:instrText xml:space="preserve"> FORMTEXT </w:instrText>
+            </w:r>
+            <w:r>
+              <w:rPr>
+                <w:rFonts w:ascii="Arial" w:hAnsi="Arial" w:cs="Arial"/>
+                <w:b/>
+                <w:sz w:val="24"/>
+                <w:szCs w:val="24"/>
+                <w:bdr w:val="single" w:sz="4" w:space="0" w:color="auto"/>
+              </w:rPr>
+            </w:r>
+            <w:r>
+              <w:rPr>
+                <w:rFonts w:ascii="Arial" w:hAnsi="Arial" w:cs="Arial"/>
+                <w:b/>
+                <w:sz w:val="24"/>
+                <w:szCs w:val="24"/>
+                <w:bdr w:val="single" w:sz="4" w:space="0" w:color="auto"/>
+              </w:rPr>
+              <w:fldChar w:fldCharType="separate"/>
+            </w:r>
+            <w:r>
+              <w:rPr>
+                <w:rFonts w:ascii="Arial" w:hAnsi="Arial" w:cs="Arial"/>
+                <w:b/>
+                <w:sz w:val="24"/>
+                <w:szCs w:val="24"/>
+                <w:bdr w:val="single" w:sz="4" w:space="0" w:color="auto"/>
+              </w:rPr>
+              <w:t>{d}</w:t>
+            </w:r>
+            <w:r>
+              <w:rPr>
+                <w:rFonts w:ascii="Arial" w:hAnsi="Arial" w:cs="Arial"/>
+                <w:b/>
+                <w:sz w:val="24"/>
+                <w:szCs w:val="24"/>
+                <w:bdr w:val="single" w:sz="4" w:space="0" w:color="auto"/>
+              </w:rPr>
+              <w:fldChar w:fldCharType="end"/>
+            </w:r>
+          </w:p>
+        </w:tc>
+        <w:tc>
+          <w:tcPr>
+            <w:tcW w:w="899" w:type="dxa"/>
+            <w:gridSpan w:val="5"/>
+            <w:tcBorders>
+              <w:top w:val="single" w:sz="4" w:space="0" w:color="auto"/>
+              <w:left w:val="nil"/>
+              <w:bottom w:val="nil"/>
+              <w:right w:val="nil"/>
+            </w:tcBorders>
+            <w:vAlign w:val="center"/>
+          </w:tcPr>
+          <w:p>
+            <w:pPr>
+              <w:jc w:val="right"/>
+              <w:rPr>
+                <w:rFonts w:ascii="Arial" w:hAnsi="Arial" w:cs="Arial"/>
+                <w:sz w:val="14"/>
+                <w:szCs w:val="14"/>
+              </w:rPr>
+            </w:pPr>
+            <w:r>
+              <w:rPr>
+                <w:rFonts w:ascii="Arial" w:hAnsi="Arial" w:cs="Arial"/>
+                <w:sz w:val="14"/>
+                <w:szCs w:val="14"/>
+              </w:rPr>
+              <w:t xml:space="preserve">Usuario </w:t>
+            </w:r>
+          </w:p>
+          <w:p>
+            <w:pPr>
+              <w:ind w:left="-108"/>
+              <w:jc w:val="right"/>
+              <w:rPr>
+                <w:rFonts w:ascii="Arial" w:hAnsi="Arial" w:cs="Arial"/>
+                <w:sz w:val="14"/>
+                <w:szCs w:val="14"/>
+              </w:rPr>
+            </w:pPr>
+            <w:r>
+              <w:rPr>
+                <w:rFonts w:ascii="Arial" w:hAnsi="Arial" w:cs="Arial"/>
+                <w:sz w:val="14"/>
+                <w:szCs w:val="14"/>
+              </w:rPr>
+              <w:t xml:space="preserve">Intranet </w:t>
+            </w:r>
+          </w:p>
+        </w:tc>
+        <w:tc>
+          <w:tcPr>
+            <w:tcW w:w="283" w:type="dxa"/>
             <w:gridSpan w:val="2"/>
             <w:tcBorders>
               <w:top w:val="single" w:sz="4" w:space="0" w:color="auto"/>
@@ -1618,67 +2055,6 @@
           </w:tcPr>
           <w:p>
             <w:pPr>
-              <w:ind w:left="-77"/>
-              <w:rPr>
-                <w:rFonts w:ascii="Arial" w:hAnsi="Arial" w:cs="Arial"/>
-                <w:sz w:val="18"/>
-                <w:szCs w:val="18"/>
-              </w:rPr>
-            </w:pPr>
-            <w:r>
-              <w:rPr>
-                <w:rFonts w:ascii="Arial" w:hAnsi="Arial" w:cs="Arial"/>
-                <w:sz w:val="18"/>
-                <w:szCs w:val="18"/>
-              </w:rPr>
-              <w:t>{b}</w:t>
-            </w:r>
-          </w:p>
-        </w:tc>
-        <w:tc>
-          <w:tcPr>
-            <w:tcW w:w="851" w:type="dxa"/>
-            <w:gridSpan w:val="2"/>
-            <w:tcBorders>
-              <w:top w:val="single" w:sz="4" w:space="0" w:color="auto"/>
-              <w:left w:val="nil"/>
-              <w:bottom w:val="nil"/>
-              <w:right w:val="nil"/>
-            </w:tcBorders>
-            <w:vAlign w:val="center"/>
-          </w:tcPr>
-          <w:p>
-            <w:pPr>
-              <w:jc w:val="center"/>
-              <w:rPr>
-                <w:rFonts w:ascii="Arial" w:hAnsi="Arial" w:cs="Arial"/>
-                <w:sz w:val="12"/>
-                <w:szCs w:val="12"/>
-              </w:rPr>
-            </w:pPr>
-            <w:r>
-              <w:rPr>
-                <w:rFonts w:ascii="Arial" w:hAnsi="Arial" w:cs="Arial"/>
-                <w:sz w:val="12"/>
-                <w:szCs w:val="12"/>
-              </w:rPr>
-              <w:t>Línea Telefónica</w:t>
-            </w:r>
-          </w:p>
-        </w:tc>
-        <w:tc>
-          <w:tcPr>
-            <w:tcW w:w="567" w:type="dxa"/>
-            <w:tcBorders>
-              <w:top w:val="single" w:sz="4" w:space="0" w:color="auto"/>
-              <w:left w:val="nil"/>
-              <w:bottom w:val="nil"/>
-              <w:right w:val="nil"/>
-            </w:tcBorders>
-            <w:vAlign w:val="center"/>
-          </w:tcPr>
-          <w:p>
-            <w:pPr>
               <w:ind w:left="-108"/>
               <w:rPr>
                 <w:rFonts w:ascii="Arial" w:hAnsi="Arial" w:cs="Arial"/>
@@ -1689,16 +2065,77 @@
             <w:r>
               <w:rPr>
                 <w:rFonts w:ascii="Arial" w:hAnsi="Arial" w:cs="Arial"/>
-                <w:sz w:val="18"/>
-                <w:szCs w:val="18"/>
-              </w:rPr>
-              <w:t>{c}</w:t>
-            </w:r>
-          </w:p>
-        </w:tc>
-        <w:tc>
-          <w:tcPr>
-            <w:tcW w:w="708" w:type="dxa"/>
+                <w:b/>
+                <w:sz w:val="24"/>
+                <w:szCs w:val="24"/>
+                <w:bdr w:val="single" w:sz="4" w:space="0" w:color="auto"/>
+              </w:rPr>
+              <w:fldChar w:fldCharType="begin">
+                <w:ffData>
+                  <w:name w:val=""/>
+                  <w:enabled/>
+                  <w:calcOnExit w:val="0"/>
+                  <w:textInput>
+                    <w:maxLength w:val="1"/>
+                    <w:format w:val="UPPERCASE"/>
+                  </w:textInput>
+                </w:ffData>
+              </w:fldChar>
+            </w:r>
+            <w:r>
+              <w:rPr>
+                <w:rFonts w:ascii="Arial" w:hAnsi="Arial" w:cs="Arial"/>
+                <w:b/>
+                <w:sz w:val="24"/>
+                <w:szCs w:val="24"/>
+                <w:bdr w:val="single" w:sz="4" w:space="0" w:color="auto"/>
+              </w:rPr>
+              <w:instrText xml:space="preserve"> FORMTEXT </w:instrText>
+            </w:r>
+            <w:r>
+              <w:rPr>
+                <w:rFonts w:ascii="Arial" w:hAnsi="Arial" w:cs="Arial"/>
+                <w:b/>
+                <w:sz w:val="24"/>
+                <w:szCs w:val="24"/>
+                <w:bdr w:val="single" w:sz="4" w:space="0" w:color="auto"/>
+              </w:rPr>
+            </w:r>
+            <w:r>
+              <w:rPr>
+                <w:rFonts w:ascii="Arial" w:hAnsi="Arial" w:cs="Arial"/>
+                <w:b/>
+                <w:sz w:val="24"/>
+                <w:szCs w:val="24"/>
+                <w:bdr w:val="single" w:sz="4" w:space="0" w:color="auto"/>
+              </w:rPr>
+              <w:fldChar w:fldCharType="separate"/>
+            </w:r>
+            <w:r>
+              <w:rPr>
+                <w:rFonts w:ascii="Arial" w:hAnsi="Arial" w:cs="Arial"/>
+                <w:b/>
+                <w:sz w:val="24"/>
+                <w:szCs w:val="24"/>
+                <w:bdr w:val="single" w:sz="4" w:space="0" w:color="auto"/>
+              </w:rPr>
+              <w:t>{f}</w:t>
+            </w:r>
+            <w:r>
+              <w:rPr>
+                <w:rFonts w:ascii="Arial" w:hAnsi="Arial" w:cs="Arial"/>
+                <w:b/>
+                <w:sz w:val="24"/>
+                <w:szCs w:val="24"/>
+                <w:bdr w:val="single" w:sz="4" w:space="0" w:color="auto"/>
+              </w:rPr>
+              <w:fldChar w:fldCharType="end"/>
+            </w:r>
+          </w:p>
+        </w:tc>
+        <w:tc>
+          <w:tcPr>
+            <w:tcW w:w="757" w:type="dxa"/>
             <w:gridSpan w:val="3"/>
             <w:tcBorders>
               <w:top w:val="single" w:sz="4" w:space="0" w:color="auto"/>
@@ -1710,55 +2147,51 @@
           </w:tcPr>
           <w:p>
             <w:pPr>
-              <w:jc w:val="center"/>
-              <w:rPr>
-                <w:rFonts w:ascii="Arial" w:hAnsi="Arial" w:cs="Arial"/>
-                <w:sz w:val="14"/>
-                <w:szCs w:val="14"/>
-              </w:rPr>
-            </w:pPr>
-            <w:r>
-              <w:rPr>
-                <w:rFonts w:ascii="Arial" w:hAnsi="Arial" w:cs="Arial"/>
-                <w:sz w:val="14"/>
-                <w:szCs w:val="14"/>
-              </w:rPr>
-              <w:t>Puesto de</w:t>
+              <w:rPr>
+                <w:rFonts w:ascii="Arial" w:hAnsi="Arial" w:cs="Arial"/>
+                <w:sz w:val="14"/>
+                <w:szCs w:val="14"/>
+              </w:rPr>
+            </w:pPr>
+            <w:r>
+              <w:rPr>
+                <w:rFonts w:ascii="Arial" w:hAnsi="Arial" w:cs="Arial"/>
+                <w:sz w:val="14"/>
+                <w:szCs w:val="14"/>
+              </w:rPr>
+              <w:t xml:space="preserve">Usuario </w:t>
             </w:r>
           </w:p>
           <w:p>
             <w:pPr>
               <w:ind w:left="-249"/>
-              <w:jc w:val="center"/>
-              <w:rPr>
-                <w:rFonts w:ascii="Arial" w:hAnsi="Arial" w:cs="Arial"/>
-                <w:sz w:val="14"/>
-                <w:szCs w:val="14"/>
-              </w:rPr>
-            </w:pPr>
-            <w:r>
-              <w:rPr>
-                <w:rFonts w:ascii="Arial" w:hAnsi="Arial" w:cs="Arial"/>
-                <w:sz w:val="14"/>
-                <w:szCs w:val="14"/>
-              </w:rPr>
-              <w:t xml:space="preserve">     Trabajo</w:t>
-            </w:r>
-          </w:p>
-          <w:p>
-            <w:pPr>
-              <w:jc w:val="center"/>
-              <w:rPr>
-                <w:rFonts w:ascii="Arial" w:hAnsi="Arial" w:cs="Arial"/>
-                <w:sz w:val="14"/>
-                <w:szCs w:val="14"/>
-              </w:rPr>
-            </w:pPr>
-          </w:p>
-        </w:tc>
-        <w:tc>
-          <w:tcPr>
-            <w:tcW w:w="576" w:type="dxa"/>
+              <w:rPr>
+                <w:rFonts w:ascii="Arial" w:hAnsi="Arial" w:cs="Arial"/>
+                <w:sz w:val="14"/>
+                <w:szCs w:val="14"/>
+              </w:rPr>
+            </w:pPr>
+            <w:r>
+              <w:rPr>
+                <w:rFonts w:ascii="Arial" w:hAnsi="Arial" w:cs="Arial"/>
+                <w:sz w:val="14"/>
+                <w:szCs w:val="14"/>
+              </w:rPr>
+              <w:t xml:space="preserve">       </w:t>
+            </w:r>
+            <w:r>
+              <w:rPr>
+                <w:rFonts w:ascii="Arial" w:hAnsi="Arial" w:cs="Arial"/>
+                <w:sz w:val="14"/>
+                <w:szCs w:val="14"/>
+              </w:rPr>
+              <w:t xml:space="preserve">Virtual </w:t>
+            </w:r>
+          </w:p>
+        </w:tc>
+        <w:tc>
+          <w:tcPr>
+            <w:tcW w:w="330" w:type="dxa"/>
             <w:tcBorders>
               <w:top w:val="single" w:sz="4" w:space="0" w:color="auto"/>
               <w:left w:val="nil"/>
@@ -1778,17 +2211,117 @@
             <w:r>
               <w:rPr>
                 <w:rFonts w:ascii="Arial" w:hAnsi="Arial" w:cs="Arial"/>
-                <w:sz w:val="18"/>
-                <w:szCs w:val="18"/>
-              </w:rPr>
-              <w:t>{d}</w:t>
-            </w:r>
-          </w:p>
-        </w:tc>
-        <w:tc>
-          <w:tcPr>
-            <w:tcW w:w="567" w:type="dxa"/>
-            <w:gridSpan w:val="3"/>
+                <w:b/>
+                <w:sz w:val="24"/>
+                <w:szCs w:val="24"/>
+                <w:bdr w:val="single" w:sz="4" w:space="0" w:color="auto"/>
+              </w:rPr>
+              <w:fldChar w:fldCharType="begin">
+                <w:ffData>
+                  <w:name w:val=""/>
+                  <w:enabled/>
+                  <w:calcOnExit w:val="0"/>
+                  <w:textInput>
+                    <w:maxLength w:val="1"/>
+                    <w:format w:val="UPPERCASE"/>
+                  </w:textInput>
+                </w:ffData>
+              </w:fldChar>
+            </w:r>
+            <w:r>
+              <w:rPr>
+                <w:rFonts w:ascii="Arial" w:hAnsi="Arial" w:cs="Arial"/>
+                <w:b/>
+                <w:sz w:val="24"/>
+                <w:szCs w:val="24"/>
+                <w:bdr w:val="single" w:sz="4" w:space="0" w:color="auto"/>
+              </w:rPr>
+              <w:instrText xml:space="preserve"> FORMTEXT </w:instrText>
+            </w:r>
+            <w:r>
+              <w:rPr>
+                <w:rFonts w:ascii="Arial" w:hAnsi="Arial" w:cs="Arial"/>
+                <w:b/>
+                <w:sz w:val="24"/>
+                <w:szCs w:val="24"/>
+                <w:bdr w:val="single" w:sz="4" w:space="0" w:color="auto"/>
+              </w:rPr>
+            </w:r>
+            <w:r>
+              <w:rPr>
+                <w:rFonts w:ascii="Arial" w:hAnsi="Arial" w:cs="Arial"/>
+                <w:b/>
+                <w:sz w:val="24"/>
+                <w:szCs w:val="24"/>
+                <w:bdr w:val="single" w:sz="4" w:space="0" w:color="auto"/>
+              </w:rPr>
+              <w:fldChar w:fldCharType="separate"/>
+            </w:r>
+            <w:r>
+              <w:rPr>
+                <w:rFonts w:ascii="Arial" w:hAnsi="Arial" w:cs="Arial"/>
+                <w:b/>
+                <w:sz w:val="24"/>
+                <w:szCs w:val="24"/>
+                <w:bdr w:val="single" w:sz="4" w:space="0" w:color="auto"/>
+              </w:rPr>
+              <w:t>{g}</w:t>
+            </w:r>
+            <w:r>
+              <w:rPr>
+                <w:rFonts w:ascii="Arial" w:hAnsi="Arial" w:cs="Arial"/>
+                <w:b/>
+                <w:sz w:val="24"/>
+                <w:szCs w:val="24"/>
+                <w:bdr w:val="single" w:sz="4" w:space="0" w:color="auto"/>
+              </w:rPr>
+              <w:fldChar w:fldCharType="end"/>
+            </w:r>
+          </w:p>
+        </w:tc>
+        <w:tc>
+          <w:tcPr>
+            <w:tcW w:w="663" w:type="dxa"/>
+            <w:gridSpan w:val="4"/>
+            <w:tcBorders>
+              <w:top w:val="nil"/>
+              <w:left w:val="nil"/>
+              <w:bottom w:val="nil"/>
+              <w:right w:val="nil"/>
+            </w:tcBorders>
+            <w:vAlign w:val="center"/>
+          </w:tcPr>
+          <w:p>
+            <w:pPr>
+              <w:ind w:left="-249" w:right="-108"/>
+              <w:jc w:val="right"/>
+              <w:rPr>
+                <w:rFonts w:ascii="Arial" w:hAnsi="Arial" w:cs="Arial"/>
+                <w:sz w:val="14"/>
+                <w:szCs w:val="14"/>
+              </w:rPr>
+            </w:pPr>
+            <w:r>
+              <w:rPr>
+                <w:rFonts w:ascii="Arial" w:hAnsi="Arial" w:cs="Arial"/>
+                <w:sz w:val="14"/>
+                <w:szCs w:val="14"/>
+              </w:rPr>
+              <w:t xml:space="preserve">Tarjeta </w:t>
+            </w:r>
+            <w:r>
+              <w:rPr>
+                <w:rFonts w:ascii="Arial" w:hAnsi="Arial" w:cs="Arial"/>
+                <w:sz w:val="14"/>
+                <w:szCs w:val="14"/>
+              </w:rPr>
+              <w:t>de Crédito</w:t>
+            </w:r>
+          </w:p>
+        </w:tc>
+        <w:tc>
+          <w:tcPr>
+            <w:tcW w:w="377" w:type="dxa"/>
             <w:tcBorders>
               <w:top w:val="single" w:sz="4" w:space="0" w:color="auto"/>
               <w:left w:val="nil"/>
@@ -1801,209 +2334,84 @@
             <w:pPr>
               <w:rPr>
                 <w:rFonts w:ascii="Arial" w:hAnsi="Arial" w:cs="Arial"/>
-                <w:sz w:val="14"/>
-                <w:szCs w:val="14"/>
-              </w:rPr>
-            </w:pPr>
-            <w:r>
-              <w:rPr>
-                <w:rFonts w:ascii="Arial" w:hAnsi="Arial" w:cs="Arial"/>
-                <w:sz w:val="14"/>
-                <w:szCs w:val="14"/>
-              </w:rPr>
-              <w:t>Usuario</w:t>
-            </w:r>
-          </w:p>
-          <w:p>
-            <w:pPr>
-              <w:ind w:left="-108"/>
-              <w:jc w:val="center"/>
-              <w:rPr>
-                <w:rFonts w:ascii="Arial" w:hAnsi="Arial" w:cs="Arial"/>
-                <w:sz w:val="14"/>
-                <w:szCs w:val="14"/>
-              </w:rPr>
-            </w:pPr>
-            <w:r>
-              <w:rPr>
-                <w:rFonts w:ascii="Arial" w:hAnsi="Arial" w:cs="Arial"/>
-                <w:sz w:val="14"/>
-                <w:szCs w:val="14"/>
-              </w:rPr>
-              <w:t>Intranet</w:t>
-            </w:r>
-          </w:p>
-        </w:tc>
-        <w:tc>
-          <w:tcPr>
-            <w:tcW w:w="567" w:type="dxa"/>
-            <w:gridSpan w:val="2"/>
-            <w:tcBorders>
-              <w:top w:val="single" w:sz="4" w:space="0" w:color="auto"/>
-              <w:left w:val="nil"/>
-              <w:bottom w:val="nil"/>
-              <w:right w:val="nil"/>
-            </w:tcBorders>
-            <w:vAlign w:val="center"/>
-          </w:tcPr>
-          <w:p>
-            <w:pPr>
-              <w:rPr>
-                <w:rFonts w:ascii="Arial" w:hAnsi="Arial" w:cs="Arial"/>
-                <w:sz w:val="18"/>
-                <w:szCs w:val="18"/>
-              </w:rPr>
-            </w:pPr>
-            <w:r>
-              <w:rPr>
-                <w:rFonts w:ascii="Arial" w:hAnsi="Arial" w:cs="Arial"/>
-                <w:sz w:val="18"/>
-                <w:szCs w:val="18"/>
-              </w:rPr>
-              <w:t>{f}</w:t>
-            </w:r>
-          </w:p>
-        </w:tc>
-        <w:tc>
-          <w:tcPr>
-            <w:tcW w:w="700" w:type="dxa"/>
-            <w:gridSpan w:val="3"/>
-            <w:tcBorders>
-              <w:top w:val="single" w:sz="4" w:space="0" w:color="auto"/>
-              <w:left w:val="nil"/>
-              <w:bottom w:val="nil"/>
-              <w:right w:val="nil"/>
-            </w:tcBorders>
-            <w:vAlign w:val="center"/>
-          </w:tcPr>
-          <w:p>
-            <w:pPr>
-              <w:rPr>
-                <w:rFonts w:ascii="Arial" w:hAnsi="Arial" w:cs="Arial"/>
-                <w:sz w:val="14"/>
-                <w:szCs w:val="14"/>
-              </w:rPr>
-            </w:pPr>
-            <w:r>
-              <w:rPr>
-                <w:rFonts w:ascii="Arial" w:hAnsi="Arial" w:cs="Arial"/>
-                <w:sz w:val="14"/>
-                <w:szCs w:val="14"/>
-              </w:rPr>
-              <w:t xml:space="preserve">Usuario </w:t>
-            </w:r>
-            <w:r>
-              <w:rPr>
-                <w:rFonts w:ascii="Arial" w:hAnsi="Arial" w:cs="Arial"/>
-                <w:sz w:val="14"/>
-                <w:szCs w:val="14"/>
-              </w:rPr>
-              <w:t xml:space="preserve">Virtual </w:t>
-            </w:r>
-          </w:p>
-        </w:tc>
-        <w:tc>
-          <w:tcPr>
-            <w:tcW w:w="576" w:type="dxa"/>
-            <w:tcBorders>
-              <w:top w:val="single" w:sz="4" w:space="0" w:color="auto"/>
-              <w:left w:val="nil"/>
-              <w:bottom w:val="nil"/>
-              <w:right w:val="nil"/>
-            </w:tcBorders>
-            <w:vAlign w:val="center"/>
-          </w:tcPr>
-          <w:p>
-            <w:pPr>
-              <w:rPr>
-                <w:rFonts w:ascii="Arial" w:hAnsi="Arial" w:cs="Arial"/>
-                <w:sz w:val="18"/>
-                <w:szCs w:val="18"/>
-              </w:rPr>
-            </w:pPr>
-            <w:r>
-              <w:rPr>
-                <w:rFonts w:ascii="Arial" w:hAnsi="Arial" w:cs="Arial"/>
-                <w:sz w:val="18"/>
-                <w:szCs w:val="18"/>
-              </w:rPr>
-              <w:t>{g}</w:t>
-            </w:r>
-          </w:p>
-        </w:tc>
-        <w:tc>
-          <w:tcPr>
-            <w:tcW w:w="570" w:type="dxa"/>
-            <w:gridSpan w:val="2"/>
-            <w:tcBorders>
-              <w:top w:val="nil"/>
-              <w:left w:val="nil"/>
-              <w:bottom w:val="nil"/>
-              <w:right w:val="nil"/>
-            </w:tcBorders>
-            <w:vAlign w:val="center"/>
-          </w:tcPr>
-          <w:p>
-            <w:pPr>
-              <w:ind w:left="-249" w:right="-108"/>
-              <w:jc w:val="right"/>
-              <w:rPr>
-                <w:rFonts w:ascii="Arial" w:hAnsi="Arial" w:cs="Arial"/>
-                <w:sz w:val="14"/>
-                <w:szCs w:val="14"/>
-              </w:rPr>
-            </w:pPr>
-            <w:r>
-              <w:rPr>
-                <w:rFonts w:ascii="Arial" w:hAnsi="Arial" w:cs="Arial"/>
-                <w:sz w:val="12"/>
-                <w:szCs w:val="14"/>
-              </w:rPr>
-              <w:t xml:space="preserve">Tarjeta </w:t>
-            </w:r>
-            <w:r>
-              <w:rPr>
-                <w:rFonts w:ascii="Arial" w:hAnsi="Arial" w:cs="Arial"/>
-                <w:sz w:val="12"/>
-                <w:szCs w:val="14"/>
-              </w:rPr>
-              <w:t>de Crédito</w:t>
-            </w:r>
-          </w:p>
-        </w:tc>
-        <w:tc>
-          <w:tcPr>
-            <w:tcW w:w="567" w:type="dxa"/>
-            <w:gridSpan w:val="3"/>
-            <w:tcBorders>
-              <w:top w:val="single" w:sz="4" w:space="0" w:color="auto"/>
-              <w:left w:val="nil"/>
-              <w:bottom w:val="nil"/>
-              <w:right w:val="nil"/>
-            </w:tcBorders>
-            <w:vAlign w:val="center"/>
-          </w:tcPr>
-          <w:p>
-            <w:pPr>
-              <w:rPr>
-                <w:rFonts w:ascii="Arial" w:hAnsi="Arial" w:cs="Arial"/>
-                <w:sz w:val="18"/>
-                <w:szCs w:val="18"/>
-              </w:rPr>
-            </w:pPr>
-            <w:r>
-              <w:rPr>
-                <w:rFonts w:ascii="Arial" w:hAnsi="Arial" w:cs="Arial"/>
-                <w:sz w:val="18"/>
-                <w:szCs w:val="18"/>
+                <w:sz w:val="18"/>
+                <w:szCs w:val="18"/>
+              </w:rPr>
+            </w:pPr>
+            <w:r>
+              <w:rPr>
+                <w:rFonts w:ascii="Arial" w:hAnsi="Arial" w:cs="Arial"/>
+                <w:b/>
+                <w:sz w:val="24"/>
+                <w:szCs w:val="24"/>
+                <w:bdr w:val="single" w:sz="4" w:space="0" w:color="auto"/>
+              </w:rPr>
+              <w:fldChar w:fldCharType="begin">
+                <w:ffData>
+                  <w:name w:val=""/>
+                  <w:enabled/>
+                  <w:calcOnExit w:val="0"/>
+                  <w:textInput>
+                    <w:maxLength w:val="1"/>
+                    <w:format w:val="UPPERCASE"/>
+                  </w:textInput>
+                </w:ffData>
+              </w:fldChar>
+            </w:r>
+            <w:r>
+              <w:rPr>
+                <w:rFonts w:ascii="Arial" w:hAnsi="Arial" w:cs="Arial"/>
+                <w:b/>
+                <w:sz w:val="24"/>
+                <w:szCs w:val="24"/>
+                <w:bdr w:val="single" w:sz="4" w:space="0" w:color="auto"/>
+              </w:rPr>
+              <w:instrText xml:space="preserve"> FORMTEXT </w:instrText>
+            </w:r>
+            <w:r>
+              <w:rPr>
+                <w:rFonts w:ascii="Arial" w:hAnsi="Arial" w:cs="Arial"/>
+                <w:b/>
+                <w:sz w:val="24"/>
+                <w:szCs w:val="24"/>
+                <w:bdr w:val="single" w:sz="4" w:space="0" w:color="auto"/>
+              </w:rPr>
+            </w:r>
+            <w:r>
+              <w:rPr>
+                <w:rFonts w:ascii="Arial" w:hAnsi="Arial" w:cs="Arial"/>
+                <w:b/>
+                <w:sz w:val="24"/>
+                <w:szCs w:val="24"/>
+                <w:bdr w:val="single" w:sz="4" w:space="0" w:color="auto"/>
+              </w:rPr>
+              <w:fldChar w:fldCharType="separate"/>
+            </w:r>
+            <w:r>
+              <w:rPr>
+                <w:rFonts w:ascii="Arial" w:hAnsi="Arial" w:cs="Arial"/>
+                <w:b/>
+                <w:sz w:val="24"/>
+                <w:szCs w:val="24"/>
+                <w:bdr w:val="single" w:sz="4" w:space="0" w:color="auto"/>
               </w:rPr>
               <w:t>{h}</w:t>
             </w:r>
-          </w:p>
-        </w:tc>
-        <w:tc>
-          <w:tcPr>
-            <w:tcW w:w="567" w:type="dxa"/>
+            <w:r>
+              <w:rPr>
+                <w:rFonts w:ascii="Arial" w:hAnsi="Arial" w:cs="Arial"/>
+                <w:b/>
+                <w:sz w:val="24"/>
+                <w:szCs w:val="24"/>
+                <w:bdr w:val="single" w:sz="4" w:space="0" w:color="auto"/>
+              </w:rPr>
+              <w:fldChar w:fldCharType="end"/>
+            </w:r>
+          </w:p>
+        </w:tc>
+        <w:tc>
+          <w:tcPr>
+            <w:tcW w:w="661" w:type="dxa"/>
             <w:gridSpan w:val="3"/>
             <w:tcBorders>
               <w:top w:val="nil"/>
@@ -2023,13 +2431,23 @@
                 <w:szCs w:val="14"/>
               </w:rPr>
             </w:pPr>
-            <w:r>
-              <w:rPr>
-                <w:rFonts w:ascii="Arial" w:hAnsi="Arial" w:cs="Arial"/>
-                <w:sz w:val="14"/>
-                <w:szCs w:val="14"/>
-              </w:rPr>
-              <w:t xml:space="preserve">Legavi </w:t>
+            <w:proofErr w:type="spellStart"/>
+            <w:r>
+              <w:rPr>
+                <w:rFonts w:ascii="Arial" w:hAnsi="Arial" w:cs="Arial"/>
+                <w:sz w:val="14"/>
+                <w:szCs w:val="14"/>
+              </w:rPr>
+              <w:t>Legavi</w:t>
+            </w:r>
+            <w:proofErr w:type="spellEnd"/>
+            <w:r>
+              <w:rPr>
+                <w:rFonts w:ascii="Arial" w:hAnsi="Arial" w:cs="Arial"/>
+                <w:sz w:val="14"/>
+                <w:szCs w:val="14"/>
+              </w:rPr>
+              <w:t xml:space="preserve"> </w:t>
             </w:r>
           </w:p>
           <w:p>
@@ -2046,8 +2464,8 @@
         </w:tc>
         <w:tc>
           <w:tcPr>
-            <w:tcW w:w="1134" w:type="dxa"/>
-            <w:gridSpan w:val="2"/>
+            <w:tcW w:w="1281" w:type="dxa"/>
+            <w:gridSpan w:val="3"/>
             <w:tcBorders>
               <w:top w:val="nil"/>
               <w:left w:val="nil"/>
@@ -2068,10 +2486,71 @@
             <w:r>
               <w:rPr>
                 <w:rFonts w:ascii="Arial" w:hAnsi="Arial" w:cs="Arial"/>
-                <w:sz w:val="18"/>
-                <w:szCs w:val="18"/>
+                <w:b/>
+                <w:sz w:val="24"/>
+                <w:szCs w:val="24"/>
+                <w:bdr w:val="single" w:sz="4" w:space="0" w:color="auto"/>
+              </w:rPr>
+              <w:fldChar w:fldCharType="begin">
+                <w:ffData>
+                  <w:name w:val=""/>
+                  <w:enabled/>
+                  <w:calcOnExit w:val="0"/>
+                  <w:textInput>
+                    <w:maxLength w:val="1"/>
+                    <w:format w:val="UPPERCASE"/>
+                  </w:textInput>
+                </w:ffData>
+              </w:fldChar>
+            </w:r>
+            <w:r>
+              <w:rPr>
+                <w:rFonts w:ascii="Arial" w:hAnsi="Arial" w:cs="Arial"/>
+                <w:b/>
+                <w:sz w:val="24"/>
+                <w:szCs w:val="24"/>
+                <w:bdr w:val="single" w:sz="4" w:space="0" w:color="auto"/>
+              </w:rPr>
+              <w:instrText xml:space="preserve"> FORMTEXT </w:instrText>
+            </w:r>
+            <w:r>
+              <w:rPr>
+                <w:rFonts w:ascii="Arial" w:hAnsi="Arial" w:cs="Arial"/>
+                <w:b/>
+                <w:sz w:val="24"/>
+                <w:szCs w:val="24"/>
+                <w:bdr w:val="single" w:sz="4" w:space="0" w:color="auto"/>
+              </w:rPr>
+            </w:r>
+            <w:r>
+              <w:rPr>
+                <w:rFonts w:ascii="Arial" w:hAnsi="Arial" w:cs="Arial"/>
+                <w:b/>
+                <w:sz w:val="24"/>
+                <w:szCs w:val="24"/>
+                <w:bdr w:val="single" w:sz="4" w:space="0" w:color="auto"/>
+              </w:rPr>
+              <w:fldChar w:fldCharType="separate"/>
+            </w:r>
+            <w:r>
+              <w:rPr>
+                <w:rFonts w:ascii="Arial" w:hAnsi="Arial" w:cs="Arial"/>
+                <w:b/>
+                <w:sz w:val="24"/>
+                <w:szCs w:val="24"/>
+                <w:bdr w:val="single" w:sz="4" w:space="0" w:color="auto"/>
               </w:rPr>
               <w:t>{i}</w:t>
+            </w:r>
+            <w:r>
+              <w:rPr>
+                <w:rFonts w:ascii="Arial" w:hAnsi="Arial" w:cs="Arial"/>
+                <w:b/>
+                <w:sz w:val="24"/>
+                <w:szCs w:val="24"/>
+                <w:bdr w:val="single" w:sz="4" w:space="0" w:color="auto"/>
+              </w:rPr>
+              <w:fldChar w:fldCharType="end"/>
             </w:r>
           </w:p>
         </w:tc>
@@ -2082,7 +2561,7 @@
         </w:trPr>
         <w:tc>
           <w:tcPr>
-            <w:tcW w:w="985" w:type="dxa"/>
+            <w:tcW w:w="989" w:type="dxa"/>
             <w:tcBorders>
               <w:top w:val="nil"/>
               <w:left w:val="single" w:sz="4" w:space="0" w:color="auto"/>
@@ -2112,7 +2591,7 @@
         </w:tc>
         <w:tc>
           <w:tcPr>
-            <w:tcW w:w="460" w:type="dxa"/>
+            <w:tcW w:w="281" w:type="dxa"/>
             <w:tcBorders>
               <w:top w:val="nil"/>
               <w:left w:val="nil"/>
@@ -2133,24 +2612,243 @@
             <w:r>
               <w:rPr>
                 <w:rFonts w:ascii="Arial" w:hAnsi="Arial" w:cs="Arial"/>
-                <w:sz w:val="18"/>
-                <w:szCs w:val="18"/>
-              </w:rPr>
-              <w:t>{j</w:t>
-            </w:r>
-            <w:r>
-              <w:rPr>
-                <w:rFonts w:ascii="Arial" w:hAnsi="Arial" w:cs="Arial"/>
-                <w:sz w:val="18"/>
-                <w:szCs w:val="18"/>
-              </w:rPr>
-              <w:t>}</w:t>
-            </w:r>
-          </w:p>
-        </w:tc>
-        <w:tc>
-          <w:tcPr>
-            <w:tcW w:w="1266" w:type="dxa"/>
+                <w:b/>
+                <w:sz w:val="24"/>
+                <w:szCs w:val="24"/>
+                <w:bdr w:val="single" w:sz="4" w:space="0" w:color="auto"/>
+              </w:rPr>
+              <w:fldChar w:fldCharType="begin">
+                <w:ffData>
+                  <w:name w:val=""/>
+                  <w:enabled/>
+                  <w:calcOnExit w:val="0"/>
+                  <w:textInput>
+                    <w:maxLength w:val="1"/>
+                    <w:format w:val="UPPERCASE"/>
+                  </w:textInput>
+                </w:ffData>
+              </w:fldChar>
+            </w:r>
+            <w:r>
+              <w:rPr>
+                <w:rFonts w:ascii="Arial" w:hAnsi="Arial" w:cs="Arial"/>
+                <w:b/>
+                <w:sz w:val="24"/>
+                <w:szCs w:val="24"/>
+                <w:bdr w:val="single" w:sz="4" w:space="0" w:color="auto"/>
+              </w:rPr>
+              <w:instrText xml:space="preserve"> FORMTEXT </w:instrText>
+            </w:r>
+            <w:r>
+              <w:rPr>
+                <w:rFonts w:ascii="Arial" w:hAnsi="Arial" w:cs="Arial"/>
+                <w:b/>
+                <w:sz w:val="24"/>
+                <w:szCs w:val="24"/>
+                <w:bdr w:val="single" w:sz="4" w:space="0" w:color="auto"/>
+              </w:rPr>
+            </w:r>
+            <w:r>
+              <w:rPr>
+                <w:rFonts w:ascii="Arial" w:hAnsi="Arial" w:cs="Arial"/>
+                <w:b/>
+                <w:sz w:val="24"/>
+                <w:szCs w:val="24"/>
+                <w:bdr w:val="single" w:sz="4" w:space="0" w:color="auto"/>
+              </w:rPr>
+              <w:fldChar w:fldCharType="separate"/>
+            </w:r>
+            <w:r>
+              <w:rPr>
+                <w:rFonts w:ascii="Arial" w:hAnsi="Arial" w:cs="Arial"/>
+                <w:b/>
+                <w:sz w:val="24"/>
+                <w:szCs w:val="24"/>
+                <w:bdr w:val="single" w:sz="4" w:space="0" w:color="auto"/>
+              </w:rPr>
+              <w:t>{j}</w:t>
+            </w:r>
+            <w:r>
+              <w:rPr>
+                <w:rFonts w:ascii="Arial" w:hAnsi="Arial" w:cs="Arial"/>
+                <w:b/>
+                <w:sz w:val="24"/>
+                <w:szCs w:val="24"/>
+                <w:bdr w:val="single" w:sz="4" w:space="0" w:color="auto"/>
+              </w:rPr>
+              <w:fldChar w:fldCharType="end"/>
+            </w:r>
+          </w:p>
+        </w:tc>
+        <w:tc>
+          <w:tcPr>
+            <w:tcW w:w="1587" w:type="dxa"/>
+            <w:gridSpan w:val="2"/>
+            <w:tcBorders>
+              <w:top w:val="nil"/>
+              <w:left w:val="nil"/>
+              <w:bottom w:val="single" w:sz="4" w:space="0" w:color="auto"/>
+              <w:right w:val="nil"/>
+            </w:tcBorders>
+            <w:vAlign w:val="center"/>
+          </w:tcPr>
+          <w:p>
+            <w:pPr>
+              <w:jc w:val="center"/>
+              <w:rPr>
+                <w:rFonts w:ascii="Arial" w:hAnsi="Arial" w:cs="Arial"/>
+                <w:sz w:val="14"/>
+                <w:szCs w:val="14"/>
+              </w:rPr>
+            </w:pPr>
+            <w:r>
+              <w:rPr>
+                <w:rFonts w:ascii="Arial" w:hAnsi="Arial" w:cs="Arial"/>
+                <w:sz w:val="14"/>
+                <w:szCs w:val="14"/>
+              </w:rPr>
+              <w:t xml:space="preserve"> </w:t>
+            </w:r>
+            <w:r>
+              <w:rPr>
+                <w:rFonts w:ascii="Arial" w:hAnsi="Arial" w:cs="Arial"/>
+                <w:sz w:val="14"/>
+                <w:szCs w:val="14"/>
+              </w:rPr>
+              <w:t>Línea Fija</w:t>
+            </w:r>
+          </w:p>
+          <w:p>
+            <w:pPr>
+              <w:jc w:val="center"/>
+              <w:rPr>
+                <w:rFonts w:ascii="Arial" w:hAnsi="Arial" w:cs="Arial"/>
+                <w:sz w:val="14"/>
+                <w:szCs w:val="14"/>
+              </w:rPr>
+            </w:pPr>
+            <w:r>
+              <w:rPr>
+                <w:rFonts w:ascii="Arial" w:hAnsi="Arial" w:cs="Arial"/>
+                <w:sz w:val="14"/>
+                <w:szCs w:val="14"/>
+              </w:rPr>
+              <w:t xml:space="preserve"> con Extensión</w:t>
+            </w:r>
+          </w:p>
+          <w:p>
+            <w:pPr>
+              <w:ind w:right="-108"/>
+              <w:rPr>
+                <w:rFonts w:ascii="Arial" w:hAnsi="Arial" w:cs="Arial"/>
+                <w:sz w:val="14"/>
+                <w:szCs w:val="14"/>
+              </w:rPr>
+            </w:pPr>
+            <w:r>
+              <w:rPr>
+                <w:rFonts w:ascii="Arial" w:hAnsi="Arial" w:cs="Arial"/>
+                <w:sz w:val="14"/>
+                <w:szCs w:val="14"/>
+              </w:rPr>
+              <w:t xml:space="preserve">              </w:t>
+            </w:r>
+          </w:p>
+        </w:tc>
+        <w:tc>
+          <w:tcPr>
+            <w:tcW w:w="236" w:type="dxa"/>
+            <w:tcBorders>
+              <w:top w:val="nil"/>
+              <w:left w:val="nil"/>
+              <w:bottom w:val="single" w:sz="4" w:space="0" w:color="auto"/>
+              <w:right w:val="nil"/>
+            </w:tcBorders>
+            <w:vAlign w:val="center"/>
+          </w:tcPr>
+          <w:p>
+            <w:pPr>
+              <w:ind w:left="-77"/>
+              <w:rPr>
+                <w:rFonts w:ascii="Arial" w:hAnsi="Arial" w:cs="Arial"/>
+                <w:sz w:val="18"/>
+                <w:szCs w:val="18"/>
+              </w:rPr>
+            </w:pPr>
+            <w:r>
+              <w:rPr>
+                <w:rFonts w:ascii="Arial" w:hAnsi="Arial" w:cs="Arial"/>
+                <w:b/>
+                <w:sz w:val="24"/>
+                <w:szCs w:val="24"/>
+                <w:bdr w:val="single" w:sz="4" w:space="0" w:color="auto"/>
+              </w:rPr>
+              <w:fldChar w:fldCharType="begin">
+                <w:ffData>
+                  <w:name w:val=""/>
+                  <w:enabled/>
+                  <w:calcOnExit w:val="0"/>
+                  <w:textInput>
+                    <w:maxLength w:val="1"/>
+                    <w:format w:val="UPPERCASE"/>
+                  </w:textInput>
+                </w:ffData>
+              </w:fldChar>
+            </w:r>
+            <w:r>
+              <w:rPr>
+                <w:rFonts w:ascii="Arial" w:hAnsi="Arial" w:cs="Arial"/>
+                <w:b/>
+                <w:sz w:val="24"/>
+                <w:szCs w:val="24"/>
+                <w:bdr w:val="single" w:sz="4" w:space="0" w:color="auto"/>
+              </w:rPr>
+              <w:instrText xml:space="preserve"> FORMTEXT </w:instrText>
+            </w:r>
+            <w:r>
+              <w:rPr>
+                <w:rFonts w:ascii="Arial" w:hAnsi="Arial" w:cs="Arial"/>
+                <w:b/>
+                <w:sz w:val="24"/>
+                <w:szCs w:val="24"/>
+                <w:bdr w:val="single" w:sz="4" w:space="0" w:color="auto"/>
+              </w:rPr>
+            </w:r>
+            <w:r>
+              <w:rPr>
+                <w:rFonts w:ascii="Arial" w:hAnsi="Arial" w:cs="Arial"/>
+                <w:b/>
+                <w:sz w:val="24"/>
+                <w:szCs w:val="24"/>
+                <w:bdr w:val="single" w:sz="4" w:space="0" w:color="auto"/>
+              </w:rPr>
+              <w:fldChar w:fldCharType="separate"/>
+            </w:r>
+            <w:r>
+              <w:rPr>
+                <w:rFonts w:ascii="Arial" w:hAnsi="Arial" w:cs="Arial"/>
+                <w:b/>
+                <w:sz w:val="24"/>
+                <w:szCs w:val="24"/>
+                <w:bdr w:val="single" w:sz="4" w:space="0" w:color="auto"/>
+              </w:rPr>
+              <w:t>{k}</w:t>
+            </w:r>
+            <w:r>
+              <w:rPr>
+                <w:rFonts w:ascii="Arial" w:hAnsi="Arial" w:cs="Arial"/>
+                <w:b/>
+                <w:sz w:val="24"/>
+                <w:szCs w:val="24"/>
+                <w:bdr w:val="single" w:sz="4" w:space="0" w:color="auto"/>
+              </w:rPr>
+              <w:fldChar w:fldCharType="end"/>
+            </w:r>
+          </w:p>
+        </w:tc>
+        <w:tc>
+          <w:tcPr>
+            <w:tcW w:w="1189" w:type="dxa"/>
             <w:gridSpan w:val="3"/>
             <w:tcBorders>
               <w:top w:val="nil"/>
@@ -2162,144 +2860,38 @@
           </w:tcPr>
           <w:p>
             <w:pPr>
+              <w:rPr>
+                <w:rFonts w:ascii="Arial" w:hAnsi="Arial" w:cs="Arial"/>
+                <w:strike/>
+                <w:sz w:val="14"/>
+                <w:szCs w:val="14"/>
+              </w:rPr>
+            </w:pPr>
+            <w:r>
+              <w:rPr>
+                <w:rFonts w:ascii="Arial" w:hAnsi="Arial" w:cs="Arial"/>
+                <w:sz w:val="14"/>
+                <w:szCs w:val="14"/>
+              </w:rPr>
+              <w:t xml:space="preserve"> Tablet </w:t>
+            </w:r>
+          </w:p>
+          <w:p>
+            <w:pPr>
               <w:jc w:val="center"/>
               <w:rPr>
                 <w:rFonts w:ascii="Arial" w:hAnsi="Arial" w:cs="Arial"/>
-                <w:sz w:val="14"/>
-                <w:szCs w:val="14"/>
-              </w:rPr>
-            </w:pPr>
-            <w:r>
-              <w:rPr>
-                <w:rFonts w:ascii="Arial" w:hAnsi="Arial" w:cs="Arial"/>
-                <w:sz w:val="14"/>
-                <w:szCs w:val="14"/>
-              </w:rPr>
-              <w:t xml:space="preserve"> </w:t>
-            </w:r>
-            <w:r>
-              <w:rPr>
-                <w:rFonts w:ascii="Arial" w:hAnsi="Arial" w:cs="Arial"/>
-                <w:sz w:val="14"/>
-                <w:szCs w:val="14"/>
-              </w:rPr>
-              <w:t>Línea Fija</w:t>
-            </w:r>
-          </w:p>
-          <w:p>
-            <w:pPr>
-              <w:jc w:val="center"/>
-              <w:rPr>
-                <w:rFonts w:ascii="Arial" w:hAnsi="Arial" w:cs="Arial"/>
-                <w:sz w:val="14"/>
-                <w:szCs w:val="14"/>
-              </w:rPr>
-            </w:pPr>
-            <w:r>
-              <w:rPr>
-                <w:rFonts w:ascii="Arial" w:hAnsi="Arial" w:cs="Arial"/>
-                <w:sz w:val="14"/>
-                <w:szCs w:val="14"/>
-              </w:rPr>
-              <w:t xml:space="preserve"> con Extensión</w:t>
-            </w:r>
-          </w:p>
-          <w:p>
-            <w:pPr>
-              <w:ind w:right="-108"/>
-              <w:rPr>
-                <w:rFonts w:ascii="Arial" w:hAnsi="Arial" w:cs="Arial"/>
-                <w:sz w:val="14"/>
-                <w:szCs w:val="14"/>
-              </w:rPr>
-            </w:pPr>
-            <w:r>
-              <w:rPr>
-                <w:rFonts w:ascii="Arial" w:hAnsi="Arial" w:cs="Arial"/>
-                <w:sz w:val="14"/>
-                <w:szCs w:val="14"/>
-              </w:rPr>
-              <w:t xml:space="preserve">              </w:t>
-            </w:r>
-          </w:p>
-        </w:tc>
-        <w:tc>
-          <w:tcPr>
-            <w:tcW w:w="567" w:type="dxa"/>
-            <w:gridSpan w:val="2"/>
-            <w:tcBorders>
-              <w:top w:val="nil"/>
-              <w:left w:val="nil"/>
-              <w:bottom w:val="single" w:sz="4" w:space="0" w:color="auto"/>
-              <w:right w:val="nil"/>
-            </w:tcBorders>
-            <w:vAlign w:val="center"/>
-          </w:tcPr>
-          <w:p>
-            <w:pPr>
-              <w:ind w:left="-77"/>
-              <w:rPr>
-                <w:rFonts w:ascii="Arial" w:hAnsi="Arial" w:cs="Arial"/>
-                <w:sz w:val="18"/>
-                <w:szCs w:val="18"/>
-              </w:rPr>
-            </w:pPr>
-            <w:r>
-              <w:rPr>
-                <w:rFonts w:ascii="Arial" w:hAnsi="Arial" w:cs="Arial"/>
-                <w:sz w:val="18"/>
-                <w:szCs w:val="18"/>
-              </w:rPr>
-              <w:t>{k}</w:t>
-            </w:r>
-          </w:p>
-        </w:tc>
-        <w:tc>
-          <w:tcPr>
-            <w:tcW w:w="851" w:type="dxa"/>
-            <w:gridSpan w:val="2"/>
-            <w:tcBorders>
-              <w:top w:val="nil"/>
-              <w:left w:val="nil"/>
-              <w:bottom w:val="single" w:sz="4" w:space="0" w:color="auto"/>
-              <w:right w:val="nil"/>
-            </w:tcBorders>
-            <w:vAlign w:val="center"/>
-          </w:tcPr>
-          <w:p>
-            <w:pPr>
-              <w:rPr>
-                <w:rFonts w:ascii="Arial" w:hAnsi="Arial" w:cs="Arial"/>
                 <w:strike/>
                 <w:sz w:val="14"/>
                 <w:szCs w:val="14"/>
               </w:rPr>
             </w:pPr>
-            <w:r>
-              <w:rPr>
-                <w:rFonts w:ascii="Arial" w:hAnsi="Arial" w:cs="Arial"/>
-                <w:sz w:val="14"/>
-                <w:szCs w:val="14"/>
-              </w:rPr>
-              <w:t xml:space="preserve"> Tablet </w:t>
-            </w:r>
-          </w:p>
-          <w:p>
-            <w:pPr>
-              <w:jc w:val="center"/>
-              <w:rPr>
-                <w:rFonts w:ascii="Arial" w:hAnsi="Arial" w:cs="Arial"/>
-                <w:strike/>
-                <w:sz w:val="14"/>
-                <w:szCs w:val="14"/>
-              </w:rPr>
-            </w:pPr>
-          </w:p>
-        </w:tc>
-        <w:tc>
-          <w:tcPr>
-            <w:tcW w:w="576" w:type="dxa"/>
-            <w:gridSpan w:val="2"/>
+          </w:p>
+        </w:tc>
+        <w:tc>
+          <w:tcPr>
+            <w:tcW w:w="993" w:type="dxa"/>
+            <w:gridSpan w:val="3"/>
             <w:tcBorders>
               <w:top w:val="nil"/>
               <w:left w:val="nil"/>
@@ -2314,31 +2906,91 @@
               <w:ind w:left="-108"/>
               <w:rPr>
                 <w:rFonts w:ascii="Arial" w:hAnsi="Arial" w:cs="Arial"/>
-                <w:sz w:val="18"/>
-                <w:szCs w:val="18"/>
-              </w:rPr>
-            </w:pPr>
-            <w:r>
-              <w:rPr>
-                <w:rFonts w:ascii="Arial" w:hAnsi="Arial" w:cs="Arial"/>
-                <w:sz w:val="18"/>
-                <w:szCs w:val="18"/>
-              </w:rPr>
-              <w:t>{l</w:t>
-            </w:r>
-            <w:r>
-              <w:rPr>
-                <w:rFonts w:ascii="Arial" w:hAnsi="Arial" w:cs="Arial"/>
-                <w:sz w:val="18"/>
-                <w:szCs w:val="18"/>
-              </w:rPr>
-              <w:t>}</w:t>
-            </w:r>
-          </w:p>
-        </w:tc>
-        <w:tc>
-          <w:tcPr>
-            <w:tcW w:w="1275" w:type="dxa"/>
+                <w:strike/>
+                <w:sz w:val="18"/>
+                <w:szCs w:val="18"/>
+              </w:rPr>
+            </w:pPr>
+            <w:r>
+              <w:rPr>
+                <w:rFonts w:ascii="Arial" w:hAnsi="Arial" w:cs="Arial"/>
+                <w:b/>
+                <w:strike/>
+                <w:sz w:val="24"/>
+                <w:szCs w:val="24"/>
+                <w:bdr w:val="single" w:sz="4" w:space="0" w:color="auto"/>
+              </w:rPr>
+              <w:fldChar w:fldCharType="begin">
+                <w:ffData>
+                  <w:name w:val=""/>
+                  <w:enabled/>
+                  <w:calcOnExit w:val="0"/>
+                  <w:textInput>
+                    <w:maxLength w:val="1"/>
+                    <w:format w:val="UPPERCASE"/>
+                  </w:textInput>
+                </w:ffData>
+              </w:fldChar>
+            </w:r>
+            <w:r>
+              <w:rPr>
+                <w:rFonts w:ascii="Arial" w:hAnsi="Arial" w:cs="Arial"/>
+                <w:b/>
+                <w:strike/>
+                <w:sz w:val="24"/>
+                <w:szCs w:val="24"/>
+                <w:bdr w:val="single" w:sz="4" w:space="0" w:color="auto"/>
+              </w:rPr>
+              <w:instrText xml:space="preserve"> FORMTEXT </w:instrText>
+            </w:r>
+            <w:r>
+              <w:rPr>
+                <w:rFonts w:ascii="Arial" w:hAnsi="Arial" w:cs="Arial"/>
+                <w:b/>
+                <w:strike/>
+                <w:sz w:val="24"/>
+                <w:szCs w:val="24"/>
+                <w:bdr w:val="single" w:sz="4" w:space="0" w:color="auto"/>
+              </w:rPr>
+            </w:r>
+            <w:r>
+              <w:rPr>
+                <w:rFonts w:ascii="Arial" w:hAnsi="Arial" w:cs="Arial"/>
+                <w:b/>
+                <w:strike/>
+                <w:sz w:val="24"/>
+                <w:szCs w:val="24"/>
+                <w:bdr w:val="single" w:sz="4" w:space="0" w:color="auto"/>
+              </w:rPr>
+              <w:fldChar w:fldCharType="separate"/>
+            </w:r>
+            <w:r>
+              <w:rPr>
+                <w:rFonts w:ascii="Arial" w:hAnsi="Arial" w:cs="Arial"/>
+                <w:b/>
+                <w:strike/>
+                <w:sz w:val="24"/>
+                <w:szCs w:val="24"/>
+                <w:bdr w:val="single" w:sz="4" w:space="0" w:color="auto"/>
+              </w:rPr>
+              <w:t>{l}</w:t>
+            </w:r>
+            <w:r>
+              <w:rPr>
+                <w:rFonts w:ascii="Arial" w:hAnsi="Arial" w:cs="Arial"/>
+                <w:b/>
+                <w:strike/>
+                <w:sz w:val="24"/>
+                <w:szCs w:val="24"/>
+                <w:bdr w:val="single" w:sz="4" w:space="0" w:color="auto"/>
+              </w:rPr>
+              <w:fldChar w:fldCharType="end"/>
+            </w:r>
+          </w:p>
+        </w:tc>
+        <w:tc>
+          <w:tcPr>
+            <w:tcW w:w="799" w:type="dxa"/>
             <w:gridSpan w:val="3"/>
             <w:tcBorders>
               <w:top w:val="nil"/>
@@ -2350,6 +3002,7 @@
           </w:tcPr>
           <w:p>
             <w:pPr>
+              <w:ind w:left="-249"/>
               <w:jc w:val="center"/>
               <w:rPr>
                 <w:rFonts w:ascii="Arial" w:hAnsi="Arial" w:cs="Arial"/>
@@ -2363,7 +3016,7 @@
                 <w:sz w:val="14"/>
                 <w:szCs w:val="14"/>
               </w:rPr>
-              <w:t>Correo</w:t>
+              <w:t xml:space="preserve">     Correo</w:t>
             </w:r>
           </w:p>
           <w:p>
@@ -2397,7 +3050,7 @@
         </w:tc>
         <w:tc>
           <w:tcPr>
-            <w:tcW w:w="567" w:type="dxa"/>
+            <w:tcW w:w="283" w:type="dxa"/>
             <w:gridSpan w:val="3"/>
             <w:tcBorders>
               <w:top w:val="nil"/>
@@ -2419,16 +3072,227 @@
             <w:r>
               <w:rPr>
                 <w:rFonts w:ascii="Arial" w:hAnsi="Arial" w:cs="Arial"/>
-                <w:sz w:val="18"/>
-                <w:szCs w:val="18"/>
+                <w:b/>
+                <w:sz w:val="24"/>
+                <w:szCs w:val="24"/>
+                <w:bdr w:val="single" w:sz="4" w:space="0" w:color="auto"/>
+              </w:rPr>
+              <w:fldChar w:fldCharType="begin">
+                <w:ffData>
+                  <w:name w:val=""/>
+                  <w:enabled/>
+                  <w:calcOnExit w:val="0"/>
+                  <w:textInput>
+                    <w:maxLength w:val="1"/>
+                    <w:format w:val="UPPERCASE"/>
+                  </w:textInput>
+                </w:ffData>
+              </w:fldChar>
+            </w:r>
+            <w:r>
+              <w:rPr>
+                <w:rFonts w:ascii="Arial" w:hAnsi="Arial" w:cs="Arial"/>
+                <w:b/>
+                <w:sz w:val="24"/>
+                <w:szCs w:val="24"/>
+                <w:bdr w:val="single" w:sz="4" w:space="0" w:color="auto"/>
+              </w:rPr>
+              <w:instrText xml:space="preserve"> FORMTEXT </w:instrText>
+            </w:r>
+            <w:r>
+              <w:rPr>
+                <w:rFonts w:ascii="Arial" w:hAnsi="Arial" w:cs="Arial"/>
+                <w:b/>
+                <w:sz w:val="24"/>
+                <w:szCs w:val="24"/>
+                <w:bdr w:val="single" w:sz="4" w:space="0" w:color="auto"/>
+              </w:rPr>
+            </w:r>
+            <w:r>
+              <w:rPr>
+                <w:rFonts w:ascii="Arial" w:hAnsi="Arial" w:cs="Arial"/>
+                <w:b/>
+                <w:sz w:val="24"/>
+                <w:szCs w:val="24"/>
+                <w:bdr w:val="single" w:sz="4" w:space="0" w:color="auto"/>
+              </w:rPr>
+              <w:fldChar w:fldCharType="separate"/>
+            </w:r>
+            <w:r>
+              <w:rPr>
+                <w:rFonts w:ascii="Arial" w:hAnsi="Arial" w:cs="Arial"/>
+                <w:b/>
+                <w:sz w:val="24"/>
+                <w:szCs w:val="24"/>
+                <w:bdr w:val="single" w:sz="4" w:space="0" w:color="auto"/>
               </w:rPr>
               <w:t>{m}</w:t>
             </w:r>
-          </w:p>
-        </w:tc>
-        <w:tc>
-          <w:tcPr>
-            <w:tcW w:w="709" w:type="dxa"/>
+            <w:r>
+              <w:rPr>
+                <w:rFonts w:ascii="Arial" w:hAnsi="Arial" w:cs="Arial"/>
+                <w:b/>
+                <w:sz w:val="24"/>
+                <w:szCs w:val="24"/>
+                <w:bdr w:val="single" w:sz="4" w:space="0" w:color="auto"/>
+              </w:rPr>
+              <w:fldChar w:fldCharType="end"/>
+            </w:r>
+          </w:p>
+        </w:tc>
+        <w:tc>
+          <w:tcPr>
+            <w:tcW w:w="851" w:type="dxa"/>
+            <w:gridSpan w:val="4"/>
+            <w:tcBorders>
+              <w:top w:val="nil"/>
+              <w:left w:val="nil"/>
+              <w:bottom w:val="single" w:sz="4" w:space="0" w:color="auto"/>
+              <w:right w:val="nil"/>
+            </w:tcBorders>
+            <w:vAlign w:val="center"/>
+          </w:tcPr>
+          <w:p>
+            <w:pPr>
+              <w:jc w:val="right"/>
+              <w:rPr>
+                <w:rFonts w:ascii="Arial" w:hAnsi="Arial" w:cs="Arial"/>
+                <w:sz w:val="14"/>
+                <w:szCs w:val="14"/>
+              </w:rPr>
+            </w:pPr>
+            <w:r>
+              <w:rPr>
+                <w:rFonts w:ascii="Arial" w:hAnsi="Arial" w:cs="Arial"/>
+                <w:sz w:val="14"/>
+                <w:szCs w:val="14"/>
+              </w:rPr>
+              <w:t xml:space="preserve">Usuario </w:t>
+            </w:r>
+            <w:proofErr w:type="spellStart"/>
+            <w:r>
+              <w:rPr>
+                <w:rFonts w:ascii="Arial" w:hAnsi="Arial" w:cs="Arial"/>
+                <w:sz w:val="14"/>
+                <w:szCs w:val="14"/>
+              </w:rPr>
+              <w:t>Infor</w:t>
+            </w:r>
+            <w:proofErr w:type="spellEnd"/>
+            <w:r>
+              <w:rPr>
+                <w:rFonts w:ascii="Arial" w:hAnsi="Arial" w:cs="Arial"/>
+                <w:sz w:val="14"/>
+                <w:szCs w:val="14"/>
+              </w:rPr>
+              <w:t xml:space="preserve"> LX </w:t>
+            </w:r>
+          </w:p>
+          <w:p>
+            <w:pPr>
+              <w:jc w:val="right"/>
+              <w:rPr>
+                <w:rFonts w:ascii="Arial" w:hAnsi="Arial" w:cs="Arial"/>
+                <w:sz w:val="14"/>
+                <w:szCs w:val="14"/>
+              </w:rPr>
+            </w:pPr>
+          </w:p>
+        </w:tc>
+        <w:tc>
+          <w:tcPr>
+            <w:tcW w:w="283" w:type="dxa"/>
+            <w:tcBorders>
+              <w:top w:val="nil"/>
+              <w:left w:val="nil"/>
+              <w:bottom w:val="single" w:sz="4" w:space="0" w:color="auto"/>
+              <w:right w:val="nil"/>
+            </w:tcBorders>
+            <w:vAlign w:val="center"/>
+          </w:tcPr>
+          <w:p>
+            <w:pPr>
+              <w:ind w:left="-108"/>
+              <w:rPr>
+                <w:rFonts w:ascii="Arial" w:hAnsi="Arial" w:cs="Arial"/>
+                <w:sz w:val="18"/>
+                <w:szCs w:val="18"/>
+              </w:rPr>
+            </w:pPr>
+            <w:r>
+              <w:rPr>
+                <w:rFonts w:ascii="Arial" w:hAnsi="Arial" w:cs="Arial"/>
+                <w:b/>
+                <w:sz w:val="24"/>
+                <w:szCs w:val="24"/>
+                <w:bdr w:val="single" w:sz="4" w:space="0" w:color="auto"/>
+              </w:rPr>
+              <w:fldChar w:fldCharType="begin">
+                <w:ffData>
+                  <w:name w:val=""/>
+                  <w:enabled/>
+                  <w:calcOnExit w:val="0"/>
+                  <w:textInput>
+                    <w:maxLength w:val="1"/>
+                    <w:format w:val="UPPERCASE"/>
+                  </w:textInput>
+                </w:ffData>
+              </w:fldChar>
+            </w:r>
+            <w:r>
+              <w:rPr>
+                <w:rFonts w:ascii="Arial" w:hAnsi="Arial" w:cs="Arial"/>
+                <w:b/>
+                <w:sz w:val="24"/>
+                <w:szCs w:val="24"/>
+                <w:bdr w:val="single" w:sz="4" w:space="0" w:color="auto"/>
+              </w:rPr>
+              <w:instrText xml:space="preserve"> FORMTEXT </w:instrText>
+            </w:r>
+            <w:r>
+              <w:rPr>
+                <w:rFonts w:ascii="Arial" w:hAnsi="Arial" w:cs="Arial"/>
+                <w:b/>
+                <w:sz w:val="24"/>
+                <w:szCs w:val="24"/>
+                <w:bdr w:val="single" w:sz="4" w:space="0" w:color="auto"/>
+              </w:rPr>
+            </w:r>
+            <w:r>
+              <w:rPr>
+                <w:rFonts w:ascii="Arial" w:hAnsi="Arial" w:cs="Arial"/>
+                <w:b/>
+                <w:sz w:val="24"/>
+                <w:szCs w:val="24"/>
+                <w:bdr w:val="single" w:sz="4" w:space="0" w:color="auto"/>
+              </w:rPr>
+              <w:fldChar w:fldCharType="separate"/>
+            </w:r>
+            <w:r>
+              <w:rPr>
+                <w:rFonts w:ascii="Arial" w:hAnsi="Arial" w:cs="Arial"/>
+                <w:b/>
+                <w:sz w:val="24"/>
+                <w:szCs w:val="24"/>
+                <w:bdr w:val="single" w:sz="4" w:space="0" w:color="auto"/>
+              </w:rPr>
+              <w:t>{n}</w:t>
+            </w:r>
+            <w:r>
+              <w:rPr>
+                <w:rFonts w:ascii="Arial" w:hAnsi="Arial" w:cs="Arial"/>
+                <w:b/>
+                <w:sz w:val="24"/>
+                <w:szCs w:val="24"/>
+                <w:bdr w:val="single" w:sz="4" w:space="0" w:color="auto"/>
+              </w:rPr>
+              <w:fldChar w:fldCharType="end"/>
+            </w:r>
+          </w:p>
+        </w:tc>
+        <w:tc>
+          <w:tcPr>
+            <w:tcW w:w="757" w:type="dxa"/>
             <w:gridSpan w:val="3"/>
             <w:tcBorders>
               <w:top w:val="nil"/>
@@ -2440,36 +3304,26 @@
           </w:tcPr>
           <w:p>
             <w:pPr>
-              <w:jc w:val="right"/>
-              <w:rPr>
-                <w:rFonts w:ascii="Arial" w:hAnsi="Arial" w:cs="Arial"/>
-                <w:sz w:val="14"/>
-                <w:szCs w:val="14"/>
-              </w:rPr>
-            </w:pPr>
-            <w:r>
-              <w:rPr>
-                <w:rFonts w:ascii="Arial" w:hAnsi="Arial" w:cs="Arial"/>
-                <w:sz w:val="14"/>
-                <w:szCs w:val="14"/>
-              </w:rPr>
-              <w:t xml:space="preserve">Usuario Infor LX </w:t>
-            </w:r>
-          </w:p>
-          <w:p>
-            <w:pPr>
-              <w:jc w:val="right"/>
-              <w:rPr>
-                <w:rFonts w:ascii="Arial" w:hAnsi="Arial" w:cs="Arial"/>
-                <w:sz w:val="14"/>
-                <w:szCs w:val="14"/>
-              </w:rPr>
-            </w:pPr>
-          </w:p>
-        </w:tc>
-        <w:tc>
-          <w:tcPr>
-            <w:tcW w:w="425" w:type="dxa"/>
+              <w:jc w:val="center"/>
+              <w:rPr>
+                <w:rFonts w:ascii="Arial" w:hAnsi="Arial" w:cs="Arial"/>
+                <w:sz w:val="14"/>
+                <w:szCs w:val="14"/>
+              </w:rPr>
+            </w:pPr>
+            <w:r>
+              <w:rPr>
+                <w:rFonts w:ascii="Arial" w:hAnsi="Arial" w:cs="Arial"/>
+                <w:sz w:val="14"/>
+                <w:szCs w:val="14"/>
+              </w:rPr>
+              <w:t>Fondo Fijo</w:t>
+            </w:r>
+          </w:p>
+        </w:tc>
+        <w:tc>
+          <w:tcPr>
+            <w:tcW w:w="330" w:type="dxa"/>
             <w:tcBorders>
               <w:top w:val="nil"/>
               <w:left w:val="nil"/>
@@ -2480,27 +3334,119 @@
           </w:tcPr>
           <w:p>
             <w:pPr>
-              <w:ind w:left="-108"/>
-              <w:rPr>
-                <w:rFonts w:ascii="Arial" w:hAnsi="Arial" w:cs="Arial"/>
-                <w:sz w:val="18"/>
-                <w:szCs w:val="18"/>
-              </w:rPr>
-            </w:pPr>
-            <w:r>
-              <w:rPr>
-                <w:rFonts w:ascii="Arial" w:hAnsi="Arial" w:cs="Arial"/>
-                <w:sz w:val="16"/>
-                <w:szCs w:val="18"/>
-              </w:rPr>
-              <w:t>{n}</w:t>
-            </w:r>
-          </w:p>
-        </w:tc>
-        <w:tc>
-          <w:tcPr>
-            <w:tcW w:w="709" w:type="dxa"/>
-            <w:gridSpan w:val="2"/>
+              <w:ind w:left="-104"/>
+              <w:rPr>
+                <w:rFonts w:ascii="Arial" w:hAnsi="Arial" w:cs="Arial"/>
+                <w:sz w:val="18"/>
+                <w:szCs w:val="18"/>
+              </w:rPr>
+            </w:pPr>
+            <w:r>
+              <w:rPr>
+                <w:rFonts w:ascii="Arial" w:hAnsi="Arial" w:cs="Arial"/>
+                <w:b/>
+                <w:sz w:val="24"/>
+                <w:szCs w:val="24"/>
+                <w:bdr w:val="single" w:sz="4" w:space="0" w:color="auto"/>
+              </w:rPr>
+              <w:fldChar w:fldCharType="begin">
+                <w:ffData>
+                  <w:name w:val=""/>
+                  <w:enabled/>
+                  <w:calcOnExit w:val="0"/>
+                  <w:textInput>
+                    <w:maxLength w:val="1"/>
+                    <w:format w:val="UPPERCASE"/>
+                  </w:textInput>
+                </w:ffData>
+              </w:fldChar>
+            </w:r>
+            <w:r>
+              <w:rPr>
+                <w:rFonts w:ascii="Arial" w:hAnsi="Arial" w:cs="Arial"/>
+                <w:b/>
+                <w:sz w:val="24"/>
+                <w:szCs w:val="24"/>
+                <w:bdr w:val="single" w:sz="4" w:space="0" w:color="auto"/>
+              </w:rPr>
+              <w:instrText xml:space="preserve"> FORMTEXT </w:instrText>
+            </w:r>
+            <w:r>
+              <w:rPr>
+                <w:rFonts w:ascii="Arial" w:hAnsi="Arial" w:cs="Arial"/>
+                <w:b/>
+                <w:sz w:val="24"/>
+                <w:szCs w:val="24"/>
+                <w:bdr w:val="single" w:sz="4" w:space="0" w:color="auto"/>
+              </w:rPr>
+            </w:r>
+            <w:r>
+              <w:rPr>
+                <w:rFonts w:ascii="Arial" w:hAnsi="Arial" w:cs="Arial"/>
+                <w:b/>
+                <w:sz w:val="24"/>
+                <w:szCs w:val="24"/>
+                <w:bdr w:val="single" w:sz="4" w:space="0" w:color="auto"/>
+              </w:rPr>
+              <w:fldChar w:fldCharType="separate"/>
+            </w:r>
+            <w:r>
+              <w:rPr>
+                <w:rFonts w:ascii="Arial" w:hAnsi="Arial" w:cs="Arial"/>
+                <w:b/>
+                <w:sz w:val="24"/>
+                <w:szCs w:val="24"/>
+                <w:bdr w:val="single" w:sz="4" w:space="0" w:color="auto"/>
+              </w:rPr>
+              <w:t>{o}</w:t>
+            </w:r>
+            <w:r>
+              <w:rPr>
+                <w:rFonts w:ascii="Arial" w:hAnsi="Arial" w:cs="Arial"/>
+                <w:b/>
+                <w:sz w:val="24"/>
+                <w:szCs w:val="24"/>
+                <w:bdr w:val="single" w:sz="4" w:space="0" w:color="auto"/>
+              </w:rPr>
+              <w:fldChar w:fldCharType="end"/>
+            </w:r>
+          </w:p>
+        </w:tc>
+        <w:tc>
+          <w:tcPr>
+            <w:tcW w:w="663" w:type="dxa"/>
+            <w:gridSpan w:val="4"/>
+            <w:tcBorders>
+              <w:top w:val="nil"/>
+              <w:left w:val="nil"/>
+              <w:bottom w:val="nil"/>
+              <w:right w:val="nil"/>
+            </w:tcBorders>
+            <w:vAlign w:val="center"/>
+          </w:tcPr>
+          <w:p>
+            <w:pPr>
+              <w:ind w:right="-108"/>
+              <w:jc w:val="right"/>
+              <w:rPr>
+                <w:rFonts w:ascii="Arial" w:hAnsi="Arial" w:cs="Arial"/>
+                <w:sz w:val="14"/>
+                <w:szCs w:val="14"/>
+              </w:rPr>
+            </w:pPr>
+            <w:r>
+              <w:rPr>
+                <w:rFonts w:ascii="Arial" w:hAnsi="Arial" w:cs="Arial"/>
+                <w:sz w:val="14"/>
+                <w:szCs w:val="14"/>
+              </w:rPr>
+              <w:t xml:space="preserve">Dotación </w:t>
+            </w:r>
+          </w:p>
+        </w:tc>
+        <w:tc>
+          <w:tcPr>
+            <w:tcW w:w="380" w:type="dxa"/>
             <w:tcBorders>
               <w:top w:val="nil"/>
               <w:left w:val="nil"/>
@@ -2511,126 +3457,86 @@
           </w:tcPr>
           <w:p>
             <w:pPr>
-              <w:jc w:val="center"/>
-              <w:rPr>
-                <w:rFonts w:ascii="Arial" w:hAnsi="Arial" w:cs="Arial"/>
-                <w:sz w:val="14"/>
-                <w:szCs w:val="14"/>
-              </w:rPr>
-            </w:pPr>
-            <w:r>
-              <w:rPr>
-                <w:rFonts w:ascii="Arial" w:hAnsi="Arial" w:cs="Arial"/>
-                <w:sz w:val="14"/>
-                <w:szCs w:val="14"/>
-              </w:rPr>
-              <w:t>Fondo Fijo</w:t>
-            </w:r>
-          </w:p>
-        </w:tc>
-        <w:tc>
-          <w:tcPr>
-            <w:tcW w:w="428" w:type="dxa"/>
-            <w:tcBorders>
-              <w:top w:val="nil"/>
-              <w:left w:val="nil"/>
-              <w:bottom w:val="single" w:sz="4" w:space="0" w:color="auto"/>
-              <w:right w:val="nil"/>
-            </w:tcBorders>
-            <w:vAlign w:val="center"/>
-          </w:tcPr>
-          <w:p>
-            <w:pPr>
-              <w:ind w:left="-104"/>
-              <w:rPr>
-                <w:rFonts w:ascii="Arial" w:hAnsi="Arial" w:cs="Arial"/>
-                <w:sz w:val="18"/>
-                <w:szCs w:val="18"/>
-              </w:rPr>
-            </w:pPr>
-            <w:r>
-              <w:rPr>
-                <w:rFonts w:ascii="Arial" w:hAnsi="Arial" w:cs="Arial"/>
-                <w:sz w:val="16"/>
-                <w:szCs w:val="18"/>
-              </w:rPr>
-              <w:t>{o</w:t>
-            </w:r>
-            <w:r>
-              <w:rPr>
-                <w:rFonts w:ascii="Arial" w:hAnsi="Arial" w:cs="Arial"/>
-                <w:sz w:val="16"/>
-                <w:szCs w:val="18"/>
-              </w:rPr>
-              <w:t>}</w:t>
-            </w:r>
-          </w:p>
-        </w:tc>
-        <w:tc>
-          <w:tcPr>
-            <w:tcW w:w="414" w:type="dxa"/>
-            <w:gridSpan w:val="2"/>
-            <w:tcBorders>
-              <w:top w:val="nil"/>
-              <w:left w:val="nil"/>
-              <w:bottom w:val="nil"/>
-              <w:right w:val="nil"/>
-            </w:tcBorders>
-            <w:vAlign w:val="center"/>
-          </w:tcPr>
-          <w:p>
-            <w:pPr>
-              <w:ind w:right="-108"/>
-              <w:jc w:val="right"/>
-              <w:rPr>
-                <w:rFonts w:ascii="Arial" w:hAnsi="Arial" w:cs="Arial"/>
-                <w:sz w:val="14"/>
-                <w:szCs w:val="14"/>
-              </w:rPr>
-            </w:pPr>
-            <w:r>
-              <w:rPr>
-                <w:rFonts w:ascii="Arial" w:hAnsi="Arial" w:cs="Arial"/>
-                <w:sz w:val="14"/>
-                <w:szCs w:val="14"/>
-              </w:rPr>
-              <w:t xml:space="preserve">Dotación </w:t>
-            </w:r>
-          </w:p>
-        </w:tc>
-        <w:tc>
-          <w:tcPr>
-            <w:tcW w:w="576" w:type="dxa"/>
-            <w:gridSpan w:val="3"/>
-            <w:tcBorders>
-              <w:top w:val="nil"/>
-              <w:left w:val="nil"/>
-              <w:bottom w:val="single" w:sz="4" w:space="0" w:color="auto"/>
-              <w:right w:val="nil"/>
-            </w:tcBorders>
-            <w:vAlign w:val="center"/>
-          </w:tcPr>
-          <w:p>
-            <w:pPr>
-              <w:rPr>
-                <w:rFonts w:ascii="Arial" w:hAnsi="Arial" w:cs="Arial"/>
-                <w:sz w:val="20"/>
-                <w:szCs w:val="18"/>
-              </w:rPr>
-            </w:pPr>
-            <w:r>
-              <w:rPr>
-                <w:rFonts w:ascii="Arial" w:hAnsi="Arial" w:cs="Arial"/>
-                <w:sz w:val="18"/>
-                <w:szCs w:val="18"/>
+              <w:rPr>
+                <w:rFonts w:ascii="Arial" w:hAnsi="Arial" w:cs="Arial"/>
+                <w:sz w:val="18"/>
+                <w:szCs w:val="18"/>
+              </w:rPr>
+            </w:pPr>
+            <w:r>
+              <w:rPr>
+                <w:rFonts w:ascii="Arial" w:hAnsi="Arial" w:cs="Arial"/>
+                <w:b/>
+                <w:sz w:val="24"/>
+                <w:szCs w:val="24"/>
+                <w:bdr w:val="single" w:sz="4" w:space="0" w:color="auto"/>
+              </w:rPr>
+              <w:fldChar w:fldCharType="begin">
+                <w:ffData>
+                  <w:name w:val=""/>
+                  <w:enabled/>
+                  <w:calcOnExit w:val="0"/>
+                  <w:textInput>
+                    <w:maxLength w:val="1"/>
+                    <w:format w:val="UPPERCASE"/>
+                  </w:textInput>
+                </w:ffData>
+              </w:fldChar>
+            </w:r>
+            <w:r>
+              <w:rPr>
+                <w:rFonts w:ascii="Arial" w:hAnsi="Arial" w:cs="Arial"/>
+                <w:b/>
+                <w:sz w:val="24"/>
+                <w:szCs w:val="24"/>
+                <w:bdr w:val="single" w:sz="4" w:space="0" w:color="auto"/>
+              </w:rPr>
+              <w:instrText xml:space="preserve"> FORMTEXT </w:instrText>
+            </w:r>
+            <w:r>
+              <w:rPr>
+                <w:rFonts w:ascii="Arial" w:hAnsi="Arial" w:cs="Arial"/>
+                <w:b/>
+                <w:sz w:val="24"/>
+                <w:szCs w:val="24"/>
+                <w:bdr w:val="single" w:sz="4" w:space="0" w:color="auto"/>
+              </w:rPr>
+            </w:r>
+            <w:r>
+              <w:rPr>
+                <w:rFonts w:ascii="Arial" w:hAnsi="Arial" w:cs="Arial"/>
+                <w:b/>
+                <w:sz w:val="24"/>
+                <w:szCs w:val="24"/>
+                <w:bdr w:val="single" w:sz="4" w:space="0" w:color="auto"/>
+              </w:rPr>
+              <w:fldChar w:fldCharType="separate"/>
+            </w:r>
+            <w:r>
+              <w:rPr>
+                <w:rFonts w:ascii="Arial" w:hAnsi="Arial" w:cs="Arial"/>
+                <w:b/>
+                <w:sz w:val="24"/>
+                <w:szCs w:val="24"/>
+                <w:bdr w:val="single" w:sz="4" w:space="0" w:color="auto"/>
               </w:rPr>
               <w:t>{p}</w:t>
             </w:r>
-          </w:p>
-        </w:tc>
-        <w:tc>
-          <w:tcPr>
-            <w:tcW w:w="1420" w:type="dxa"/>
+            <w:r>
+              <w:rPr>
+                <w:rFonts w:ascii="Arial" w:hAnsi="Arial" w:cs="Arial"/>
+                <w:b/>
+                <w:sz w:val="24"/>
+                <w:szCs w:val="24"/>
+                <w:bdr w:val="single" w:sz="4" w:space="0" w:color="auto"/>
+              </w:rPr>
+              <w:fldChar w:fldCharType="end"/>
+            </w:r>
+          </w:p>
+        </w:tc>
+        <w:tc>
+          <w:tcPr>
+            <w:tcW w:w="1465" w:type="dxa"/>
             <w:gridSpan w:val="4"/>
             <w:tcBorders>
               <w:top w:val="nil"/>
@@ -2645,7 +3551,7 @@
               <w:ind w:left="-108" w:right="-79"/>
               <w:rPr>
                 <w:rFonts w:ascii="Arial" w:hAnsi="Arial" w:cs="Arial"/>
-                <w:sz w:val="18"/>
+                <w:sz w:val="14"/>
                 <w:szCs w:val="14"/>
               </w:rPr>
             </w:pPr>
@@ -2678,11 +3584,72 @@
             <w:r>
               <w:rPr>
                 <w:rFonts w:ascii="Arial" w:hAnsi="Arial" w:cs="Arial"/>
-                <w:sz w:val="16"/>
-                <w:szCs w:val="14"/>
+                <w:b/>
+                <w:sz w:val="24"/>
+                <w:szCs w:val="24"/>
+                <w:bdr w:val="single" w:sz="4" w:space="0" w:color="auto"/>
+              </w:rPr>
+              <w:fldChar w:fldCharType="begin">
+                <w:ffData>
+                  <w:name w:val=""/>
+                  <w:enabled/>
+                  <w:calcOnExit w:val="0"/>
+                  <w:textInput>
+                    <w:maxLength w:val="1"/>
+                    <w:format w:val="UPPERCASE"/>
+                  </w:textInput>
+                </w:ffData>
+              </w:fldChar>
+            </w:r>
+            <w:r>
+              <w:rPr>
+                <w:rFonts w:ascii="Arial" w:hAnsi="Arial" w:cs="Arial"/>
+                <w:b/>
+                <w:sz w:val="24"/>
+                <w:szCs w:val="24"/>
+                <w:bdr w:val="single" w:sz="4" w:space="0" w:color="auto"/>
+              </w:rPr>
+              <w:instrText xml:space="preserve"> FORMTEXT </w:instrText>
+            </w:r>
+            <w:r>
+              <w:rPr>
+                <w:rFonts w:ascii="Arial" w:hAnsi="Arial" w:cs="Arial"/>
+                <w:b/>
+                <w:sz w:val="24"/>
+                <w:szCs w:val="24"/>
+                <w:bdr w:val="single" w:sz="4" w:space="0" w:color="auto"/>
+              </w:rPr>
+            </w:r>
+            <w:r>
+              <w:rPr>
+                <w:rFonts w:ascii="Arial" w:hAnsi="Arial" w:cs="Arial"/>
+                <w:b/>
+                <w:sz w:val="24"/>
+                <w:szCs w:val="24"/>
+                <w:bdr w:val="single" w:sz="4" w:space="0" w:color="auto"/>
+              </w:rPr>
+              <w:fldChar w:fldCharType="separate"/>
+            </w:r>
+            <w:r>
+              <w:rPr>
+                <w:rFonts w:ascii="Arial" w:hAnsi="Arial" w:cs="Arial"/>
+                <w:b/>
+                <w:sz w:val="24"/>
+                <w:szCs w:val="24"/>
+                <w:bdr w:val="single" w:sz="4" w:space="0" w:color="auto"/>
               </w:rPr>
               <w:t>{q}</w:t>
             </w:r>
+            <w:r>
+              <w:rPr>
+                <w:rFonts w:ascii="Arial" w:hAnsi="Arial" w:cs="Arial"/>
+                <w:b/>
+                <w:sz w:val="24"/>
+                <w:szCs w:val="24"/>
+                <w:bdr w:val="single" w:sz="4" w:space="0" w:color="auto"/>
+              </w:rPr>
+              <w:fldChar w:fldCharType="end"/>
+            </w:r>
           </w:p>
           <w:p>
             <w:pPr>
@@ -2697,49 +3664,6 @@
           <w:p>
             <w:pPr>
               <w:ind w:left="-108" w:right="-79"/>
-              <w:rPr>
-                <w:rFonts w:ascii="Arial" w:hAnsi="Arial" w:cs="Arial"/>
-                <w:sz w:val="16"/>
-                <w:szCs w:val="16"/>
-              </w:rPr>
-            </w:pPr>
-            <w:r>
-              <w:rPr>
-                <w:rFonts w:ascii="Arial" w:hAnsi="Arial" w:cs="Arial"/>
-                <w:sz w:val="16"/>
-                <w:szCs w:val="16"/>
-              </w:rPr>
-              <w:t xml:space="preserve">  </w:t>
-            </w:r>
-            <w:r>
-              <w:rPr>
-                <w:rFonts w:ascii="Arial" w:hAnsi="Arial" w:cs="Arial"/>
-                <w:sz w:val="16"/>
-                <w:szCs w:val="16"/>
-              </w:rPr>
-              <w:t>Otro</w:t>
-            </w:r>
-            <w:r>
-              <w:rPr>
-                <w:rFonts w:ascii="Arial" w:hAnsi="Arial" w:cs="Arial"/>
-                <w:sz w:val="16"/>
-                <w:szCs w:val="16"/>
-              </w:rPr>
-              <w:t xml:space="preserve"> {otro</w:t>
-            </w:r>
-            <w:r>
-              <w:rPr>
-                <w:rFonts w:ascii="Arial" w:hAnsi="Arial" w:cs="Arial"/>
-                <w:sz w:val="16"/>
-                <w:szCs w:val="16"/>
-              </w:rPr>
-              <w:t>}</w:t>
-            </w:r>
-          </w:p>
-          <w:p>
-            <w:pPr>
-              <w:ind w:left="-108" w:right="-79"/>
-              <w:jc w:val="center"/>
               <w:rPr>
                 <w:rFonts w:ascii="Arial" w:hAnsi="Arial" w:cs="Arial"/>
                 <w:sz w:val="16"/>
@@ -2752,7 +3676,7 @@
                 <w:noProof/>
                 <w:sz w:val="16"/>
                 <w:szCs w:val="16"/>
-                <w:lang w:eastAsia="es-MX"/>
+                <w:lang w:eastAsia="es-CO"/>
               </w:rPr>
               <mc:AlternateContent>
                 <mc:Choice Requires="wps">
@@ -2760,10 +3684,10 @@
                     <wp:anchor distT="0" distB="0" distL="114300" distR="114300" simplePos="0" relativeHeight="251659264" behindDoc="0" locked="0" layoutInCell="1" allowOverlap="1" wp14:anchorId="4620AF79" wp14:editId="34717B98">
                       <wp:simplePos x="0" y="0"/>
                       <wp:positionH relativeFrom="column">
-                        <wp:posOffset>207010</wp:posOffset>
+                        <wp:posOffset>273685</wp:posOffset>
                       </wp:positionH>
                       <wp:positionV relativeFrom="paragraph">
-                        <wp:posOffset>55880</wp:posOffset>
+                        <wp:posOffset>55245</wp:posOffset>
                       </wp:positionV>
                       <wp:extent cx="568960" cy="0"/>
                       <wp:effectExtent l="0" t="0" r="21590" b="19050"/>
@@ -2810,23 +3734,58 @@
                     </wp:anchor>
                   </w:drawing>
                 </mc:Choice>
-                <mc:Fallback>
+                <mc:Fallback xmlns:w16se="http://schemas.microsoft.com/office/word/2015/wordml/symex" xmlns:cx1="http://schemas.microsoft.com/office/drawing/2015/9/8/chartex" xmlns:cx="http://schemas.microsoft.com/office/drawing/2014/chartex">
                   <w:pict>
-                    <v:line w14:anchorId="606B4143" id="Conector recto 1" o:spid="_x0000_s1026" style="position:absolute;z-index:251659264;visibility:visible;mso-wrap-style:square;mso-width-percent:0;mso-height-percent:0;mso-wrap-distance-left:9pt;mso-wrap-distance-top:0;mso-wrap-distance-right:9pt;mso-wrap-distance-bottom:0;mso-position-horizontal:absolute;mso-position-horizontal-relative:text;mso-position-vertical:absolute;mso-position-vertical-relative:text;mso-width-percent:0;mso-height-percent:0;mso-width-relative:margin;mso-height-relative:margin" from="16.3pt,4.4pt" to="61.1pt,4.4pt" o:gfxdata="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" strokecolor="black [3200]" strokeweight=".5pt">
+                    <v:line w14:anchorId="4E07A77C" id="Conector recto 1" o:spid="_x0000_s1026" style="position:absolute;z-index:251659264;visibility:visible;mso-wrap-style:square;mso-width-percent:0;mso-height-percent:0;mso-wrap-distance-left:9pt;mso-wrap-distance-top:0;mso-wrap-distance-right:9pt;mso-wrap-distance-bottom:0;mso-position-horizontal:absolute;mso-position-horizontal-relative:text;mso-position-vertical:absolute;mso-position-vertical-relative:text;mso-width-percent:0;mso-height-percent:0;mso-width-relative:margin;mso-height-relative:margin" from="21.55pt,4.35pt" to="66.35pt,4.35pt" o:gfxdata="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" strokecolor="black [3200]" strokeweight=".5pt">
                       <v:stroke joinstyle="miter"/>
                     </v:line>
                   </w:pict>
                 </mc:Fallback>
               </mc:AlternateContent>
             </w:r>
+            <w:r>
+              <w:rPr>
+                <w:rFonts w:ascii="Arial" w:hAnsi="Arial" w:cs="Arial"/>
+                <w:sz w:val="16"/>
+                <w:szCs w:val="16"/>
+              </w:rPr>
+              <w:t xml:space="preserve">  </w:t>
+            </w:r>
+            <w:r>
+              <w:rPr>
+                <w:rFonts w:ascii="Arial" w:hAnsi="Arial" w:cs="Arial"/>
+                <w:sz w:val="16"/>
+                <w:szCs w:val="16"/>
+              </w:rPr>
+              <w:t>Otro</w:t>
+            </w:r>
+            <w:r>
+              <w:rPr>
+                <w:rFonts w:ascii="Arial" w:hAnsi="Arial" w:cs="Arial"/>
+                <w:sz w:val="16"/>
+                <w:szCs w:val="16"/>
+              </w:rPr>
+              <w:t xml:space="preserve"> {otro}</w:t>
+            </w:r>
+          </w:p>
+          <w:p>
+            <w:pPr>
+              <w:ind w:left="-108" w:right="-79"/>
+              <w:jc w:val="center"/>
+              <w:rPr>
+                <w:rFonts w:ascii="Arial" w:hAnsi="Arial" w:cs="Arial"/>
+                <w:sz w:val="16"/>
+                <w:szCs w:val="16"/>
+              </w:rPr>
+            </w:pPr>
           </w:p>
         </w:tc>
       </w:tr>
       <w:tr>
         <w:tc>
           <w:tcPr>
-            <w:tcW w:w="11228" w:type="dxa"/>
-            <w:gridSpan w:val="33"/>
+            <w:tcW w:w="11086" w:type="dxa"/>
+            <w:gridSpan w:val="35"/>
             <w:tcBorders>
               <w:top w:val="single" w:sz="4" w:space="0" w:color="auto"/>
             </w:tcBorders>
@@ -2903,8 +3862,8 @@
       <w:tr>
         <w:tc>
           <w:tcPr>
-            <w:tcW w:w="3510" w:type="dxa"/>
-            <w:gridSpan w:val="8"/>
+            <w:tcW w:w="3522" w:type="dxa"/>
+            <w:gridSpan w:val="7"/>
             <w:shd w:val="clear" w:color="auto" w:fill="DEEAF6" w:themeFill="accent1" w:themeFillTint="33"/>
             <w:vAlign w:val="center"/>
           </w:tcPr>
@@ -2932,7 +3891,7 @@
         <w:tc>
           <w:tcPr>
             <w:tcW w:w="3443" w:type="dxa"/>
-            <w:gridSpan w:val="10"/>
+            <w:gridSpan w:val="12"/>
             <w:shd w:val="clear" w:color="auto" w:fill="DEEAF6" w:themeFill="accent1" w:themeFillTint="33"/>
             <w:vAlign w:val="center"/>
           </w:tcPr>
@@ -2959,8 +3918,8 @@
         </w:tc>
         <w:tc>
           <w:tcPr>
-            <w:tcW w:w="4275" w:type="dxa"/>
-            <w:gridSpan w:val="15"/>
+            <w:tcW w:w="4121" w:type="dxa"/>
+            <w:gridSpan w:val="16"/>
             <w:shd w:val="clear" w:color="auto" w:fill="DEEAF6" w:themeFill="accent1" w:themeFillTint="33"/>
             <w:vAlign w:val="center"/>
           </w:tcPr>
@@ -2999,8 +3958,19 @@
                 <w:sz w:val="18"/>
                 <w:szCs w:val="18"/>
               </w:rPr>
-              <w:t xml:space="preserve"> LATAM</w:t>
-            </w:r>
+              <w:t xml:space="preserve"> </w:t>
+            </w:r>
+            <w:proofErr w:type="spellStart"/>
+            <w:r>
+              <w:rPr>
+                <w:rFonts w:ascii="Arial" w:hAnsi="Arial" w:cs="Arial"/>
+                <w:b/>
+                <w:sz w:val="18"/>
+                <w:szCs w:val="18"/>
+              </w:rPr>
+              <w:t>LATAM</w:t>
+            </w:r>
+            <w:proofErr w:type="spellEnd"/>
           </w:p>
         </w:tc>
       </w:tr>
@@ -3010,8 +3980,8 @@
         </w:trPr>
         <w:tc>
           <w:tcPr>
-            <w:tcW w:w="3510" w:type="dxa"/>
-            <w:gridSpan w:val="8"/>
+            <w:tcW w:w="3522" w:type="dxa"/>
+            <w:gridSpan w:val="7"/>
             <w:vAlign w:val="bottom"/>
           </w:tcPr>
           <w:p>
@@ -3035,7 +4005,7 @@
         <w:tc>
           <w:tcPr>
             <w:tcW w:w="3443" w:type="dxa"/>
-            <w:gridSpan w:val="10"/>
+            <w:gridSpan w:val="12"/>
             <w:vAlign w:val="bottom"/>
           </w:tcPr>
           <w:p>
@@ -3058,8 +4028,8 @@
         </w:tc>
         <w:tc>
           <w:tcPr>
-            <w:tcW w:w="4275" w:type="dxa"/>
-            <w:gridSpan w:val="15"/>
+            <w:tcW w:w="4121" w:type="dxa"/>
+            <w:gridSpan w:val="16"/>
             <w:vAlign w:val="bottom"/>
           </w:tcPr>
           <w:p>
@@ -3087,8 +4057,8 @@
         </w:trPr>
         <w:tc>
           <w:tcPr>
-            <w:tcW w:w="3510" w:type="dxa"/>
-            <w:gridSpan w:val="8"/>
+            <w:tcW w:w="3522" w:type="dxa"/>
+            <w:gridSpan w:val="7"/>
             <w:vAlign w:val="bottom"/>
           </w:tcPr>
           <w:p>
@@ -3114,7 +4084,7 @@
         <w:tc>
           <w:tcPr>
             <w:tcW w:w="3443" w:type="dxa"/>
-            <w:gridSpan w:val="10"/>
+            <w:gridSpan w:val="12"/>
             <w:vAlign w:val="bottom"/>
           </w:tcPr>
           <w:p>
@@ -3137,8 +4107,8 @@
         </w:tc>
         <w:tc>
           <w:tcPr>
-            <w:tcW w:w="4275" w:type="dxa"/>
-            <w:gridSpan w:val="15"/>
+            <w:tcW w:w="4121" w:type="dxa"/>
+            <w:gridSpan w:val="16"/>
             <w:vAlign w:val="bottom"/>
           </w:tcPr>
           <w:p>
@@ -3163,8 +4133,8 @@
       <w:tr>
         <w:tc>
           <w:tcPr>
-            <w:tcW w:w="11228" w:type="dxa"/>
-            <w:gridSpan w:val="33"/>
+            <w:tcW w:w="11086" w:type="dxa"/>
+            <w:gridSpan w:val="35"/>
             <w:shd w:val="clear" w:color="auto" w:fill="2E74B5" w:themeFill="accent1" w:themeFillShade="BF"/>
             <w:vAlign w:val="center"/>
           </w:tcPr>
@@ -3264,8 +4234,8 @@
       <w:tr>
         <w:tc>
           <w:tcPr>
-            <w:tcW w:w="2711" w:type="dxa"/>
-            <w:gridSpan w:val="5"/>
+            <w:tcW w:w="2857" w:type="dxa"/>
+            <w:gridSpan w:val="4"/>
             <w:shd w:val="clear" w:color="auto" w:fill="DEEAF6" w:themeFill="accent1" w:themeFillTint="33"/>
             <w:vAlign w:val="center"/>
           </w:tcPr>
@@ -3292,7 +4262,7 @@
         </w:tc>
         <w:tc>
           <w:tcPr>
-            <w:tcW w:w="2552" w:type="dxa"/>
+            <w:tcW w:w="2418" w:type="dxa"/>
             <w:gridSpan w:val="7"/>
             <w:shd w:val="clear" w:color="auto" w:fill="DEEAF6" w:themeFill="accent1" w:themeFillTint="33"/>
             <w:vAlign w:val="center"/>
@@ -3320,45 +4290,65 @@
         </w:tc>
         <w:tc>
           <w:tcPr>
-            <w:tcW w:w="3127" w:type="dxa"/>
+            <w:tcW w:w="2829" w:type="dxa"/>
+            <w:gridSpan w:val="13"/>
+            <w:shd w:val="clear" w:color="auto" w:fill="DEEAF6" w:themeFill="accent1" w:themeFillTint="33"/>
+            <w:vAlign w:val="center"/>
+          </w:tcPr>
+          <w:p>
+            <w:pPr>
+              <w:jc w:val="center"/>
+              <w:rPr>
+                <w:rFonts w:ascii="Arial" w:hAnsi="Arial" w:cs="Arial"/>
+                <w:b/>
+                <w:sz w:val="18"/>
+                <w:szCs w:val="18"/>
+              </w:rPr>
+            </w:pPr>
+            <w:r>
+              <w:rPr>
+                <w:rFonts w:ascii="Arial" w:hAnsi="Arial" w:cs="Arial"/>
+                <w:b/>
+                <w:sz w:val="18"/>
+                <w:szCs w:val="18"/>
+              </w:rPr>
+              <w:t>GERENTE DE TALENTO HUMANO</w:t>
+            </w:r>
+            <w:r>
+              <w:rPr>
+                <w:rFonts w:ascii="Arial" w:hAnsi="Arial" w:cs="Arial"/>
+                <w:b/>
+                <w:sz w:val="18"/>
+                <w:szCs w:val="18"/>
+              </w:rPr>
+              <w:t xml:space="preserve"> </w:t>
+            </w:r>
+            <w:proofErr w:type="spellStart"/>
+            <w:r>
+              <w:rPr>
+                <w:rFonts w:ascii="Arial" w:hAnsi="Arial" w:cs="Arial"/>
+                <w:b/>
+                <w:sz w:val="18"/>
+                <w:szCs w:val="18"/>
+              </w:rPr>
+              <w:t>LATAM</w:t>
+            </w:r>
+            <w:proofErr w:type="spellEnd"/>
+            <w:r>
+              <w:rPr>
+                <w:rFonts w:ascii="Arial" w:hAnsi="Arial" w:cs="Arial"/>
+                <w:b/>
+                <w:sz w:val="18"/>
+                <w:szCs w:val="18"/>
+              </w:rPr>
+              <w:t xml:space="preserve"> </w:t>
+            </w:r>
+          </w:p>
+        </w:tc>
+        <w:tc>
+          <w:tcPr>
+            <w:tcW w:w="2982" w:type="dxa"/>
             <w:gridSpan w:val="11"/>
-            <w:shd w:val="clear" w:color="auto" w:fill="DEEAF6" w:themeFill="accent1" w:themeFillTint="33"/>
-            <w:vAlign w:val="center"/>
-          </w:tcPr>
-          <w:p>
-            <w:pPr>
-              <w:jc w:val="center"/>
-              <w:rPr>
-                <w:rFonts w:ascii="Arial" w:hAnsi="Arial" w:cs="Arial"/>
-                <w:b/>
-                <w:sz w:val="18"/>
-                <w:szCs w:val="18"/>
-              </w:rPr>
-            </w:pPr>
-            <w:r>
-              <w:rPr>
-                <w:rFonts w:ascii="Arial" w:hAnsi="Arial" w:cs="Arial"/>
-                <w:b/>
-                <w:sz w:val="18"/>
-                <w:szCs w:val="18"/>
-              </w:rPr>
-              <w:t>GERENTE DE TALENTO HUMANO</w:t>
-            </w:r>
-            <w:r>
-              <w:rPr>
-                <w:rFonts w:ascii="Arial" w:hAnsi="Arial" w:cs="Arial"/>
-                <w:b/>
-                <w:sz w:val="18"/>
-                <w:szCs w:val="18"/>
-              </w:rPr>
-              <w:t xml:space="preserve"> LATAM </w:t>
-            </w:r>
-          </w:p>
-        </w:tc>
-        <w:tc>
-          <w:tcPr>
-            <w:tcW w:w="2838" w:type="dxa"/>
-            <w:gridSpan w:val="10"/>
             <w:shd w:val="clear" w:color="auto" w:fill="DEEAF6" w:themeFill="accent1" w:themeFillTint="33"/>
             <w:vAlign w:val="center"/>
           </w:tcPr>
@@ -3390,8 +4380,8 @@
         </w:trPr>
         <w:tc>
           <w:tcPr>
-            <w:tcW w:w="2711" w:type="dxa"/>
-            <w:gridSpan w:val="5"/>
+            <w:tcW w:w="2857" w:type="dxa"/>
+            <w:gridSpan w:val="4"/>
             <w:vAlign w:val="bottom"/>
           </w:tcPr>
           <w:p>
@@ -3414,7 +4404,7 @@
         </w:tc>
         <w:tc>
           <w:tcPr>
-            <w:tcW w:w="2552" w:type="dxa"/>
+            <w:tcW w:w="2418" w:type="dxa"/>
             <w:gridSpan w:val="7"/>
             <w:vAlign w:val="bottom"/>
           </w:tcPr>
@@ -3438,41 +4428,41 @@
         </w:tc>
         <w:tc>
           <w:tcPr>
-            <w:tcW w:w="3127" w:type="dxa"/>
+            <w:tcW w:w="2829" w:type="dxa"/>
+            <w:gridSpan w:val="13"/>
+            <w:vAlign w:val="bottom"/>
+          </w:tcPr>
+          <w:p>
+            <w:pPr>
+              <w:rPr>
+                <w:rFonts w:ascii="Arial" w:hAnsi="Arial" w:cs="Arial"/>
+                <w:sz w:val="14"/>
+                <w:szCs w:val="14"/>
+              </w:rPr>
+            </w:pPr>
+          </w:p>
+          <w:p>
+            <w:pPr>
+              <w:rPr>
+                <w:rFonts w:ascii="Arial" w:hAnsi="Arial" w:cs="Arial"/>
+                <w:sz w:val="14"/>
+                <w:szCs w:val="14"/>
+              </w:rPr>
+            </w:pPr>
+            <w:r>
+              <w:rPr>
+                <w:rFonts w:ascii="Arial" w:hAnsi="Arial" w:cs="Arial"/>
+                <w:sz w:val="14"/>
+                <w:szCs w:val="14"/>
+              </w:rPr>
+              <w:t xml:space="preserve">Nombre </w:t>
+            </w:r>
+          </w:p>
+        </w:tc>
+        <w:tc>
+          <w:tcPr>
+            <w:tcW w:w="2982" w:type="dxa"/>
             <w:gridSpan w:val="11"/>
-            <w:vAlign w:val="bottom"/>
-          </w:tcPr>
-          <w:p>
-            <w:pPr>
-              <w:rPr>
-                <w:rFonts w:ascii="Arial" w:hAnsi="Arial" w:cs="Arial"/>
-                <w:sz w:val="14"/>
-                <w:szCs w:val="14"/>
-              </w:rPr>
-            </w:pPr>
-          </w:p>
-          <w:p>
-            <w:pPr>
-              <w:rPr>
-                <w:rFonts w:ascii="Arial" w:hAnsi="Arial" w:cs="Arial"/>
-                <w:sz w:val="14"/>
-                <w:szCs w:val="14"/>
-              </w:rPr>
-            </w:pPr>
-            <w:r>
-              <w:rPr>
-                <w:rFonts w:ascii="Arial" w:hAnsi="Arial" w:cs="Arial"/>
-                <w:sz w:val="14"/>
-                <w:szCs w:val="14"/>
-              </w:rPr>
-              <w:t xml:space="preserve">Nombre </w:t>
-            </w:r>
-          </w:p>
-        </w:tc>
-        <w:tc>
-          <w:tcPr>
-            <w:tcW w:w="2838" w:type="dxa"/>
-            <w:gridSpan w:val="10"/>
             <w:vAlign w:val="bottom"/>
           </w:tcPr>
           <w:p>
@@ -3500,8 +4490,8 @@
         </w:trPr>
         <w:tc>
           <w:tcPr>
-            <w:tcW w:w="2711" w:type="dxa"/>
-            <w:gridSpan w:val="5"/>
+            <w:tcW w:w="2857" w:type="dxa"/>
+            <w:gridSpan w:val="4"/>
             <w:vAlign w:val="bottom"/>
           </w:tcPr>
           <w:p>
@@ -3524,7 +4514,7 @@
         </w:tc>
         <w:tc>
           <w:tcPr>
-            <w:tcW w:w="2552" w:type="dxa"/>
+            <w:tcW w:w="2418" w:type="dxa"/>
             <w:gridSpan w:val="7"/>
             <w:vAlign w:val="bottom"/>
           </w:tcPr>
@@ -3548,32 +4538,32 @@
         </w:tc>
         <w:tc>
           <w:tcPr>
-            <w:tcW w:w="3127" w:type="dxa"/>
+            <w:tcW w:w="2829" w:type="dxa"/>
+            <w:gridSpan w:val="13"/>
+            <w:vAlign w:val="bottom"/>
+          </w:tcPr>
+          <w:p>
+            <w:pPr>
+              <w:rPr>
+                <w:rFonts w:ascii="Arial" w:hAnsi="Arial" w:cs="Arial"/>
+                <w:sz w:val="14"/>
+                <w:szCs w:val="14"/>
+              </w:rPr>
+            </w:pPr>
+            <w:r>
+              <w:rPr>
+                <w:rFonts w:ascii="Arial" w:hAnsi="Arial" w:cs="Arial"/>
+                <w:sz w:val="14"/>
+                <w:szCs w:val="14"/>
+              </w:rPr>
+              <w:t>Firma y fecha</w:t>
+            </w:r>
+          </w:p>
+        </w:tc>
+        <w:tc>
+          <w:tcPr>
+            <w:tcW w:w="2982" w:type="dxa"/>
             <w:gridSpan w:val="11"/>
-            <w:vAlign w:val="bottom"/>
-          </w:tcPr>
-          <w:p>
-            <w:pPr>
-              <w:rPr>
-                <w:rFonts w:ascii="Arial" w:hAnsi="Arial" w:cs="Arial"/>
-                <w:sz w:val="14"/>
-                <w:szCs w:val="14"/>
-              </w:rPr>
-            </w:pPr>
-            <w:r>
-              <w:rPr>
-                <w:rFonts w:ascii="Arial" w:hAnsi="Arial" w:cs="Arial"/>
-                <w:sz w:val="14"/>
-                <w:szCs w:val="14"/>
-              </w:rPr>
-              <w:t>Firma y fecha</w:t>
-            </w:r>
-          </w:p>
-        </w:tc>
-        <w:tc>
-          <w:tcPr>
-            <w:tcW w:w="2838" w:type="dxa"/>
-            <w:gridSpan w:val="10"/>
             <w:vAlign w:val="bottom"/>
           </w:tcPr>
           <w:p>

</xml_diff>

<commit_message>
Plantilla: Nexus y su recuadro alineados a la derecha sin espacios de relleno (no se separan al imprimir)
</commit_message>
<xml_diff>
--- a/COPIA_F-TH-028_REQUISICIÓN_DE_PERSONAL _V03.docx
+++ b/COPIA_F-TH-028_REQUISICIÓN_DE_PERSONAL _V03.docx
@@ -3548,21 +3548,14 @@
           </w:tcPr>
           <w:p>
             <w:pPr>
-              <w:ind w:left="-108" w:right="-79"/>
-              <w:rPr>
-                <w:rFonts w:ascii="Arial" w:hAnsi="Arial" w:cs="Arial"/>
-                <w:sz w:val="14"/>
-                <w:szCs w:val="14"/>
-              </w:rPr>
-            </w:pPr>
-            <w:r>
-              <w:rPr>
-                <w:rFonts w:ascii="Arial" w:hAnsi="Arial" w:cs="Arial"/>
-                <w:sz w:val="16"/>
-                <w:szCs w:val="16"/>
-              </w:rPr>
-              <w:t xml:space="preserve">       </w:t>
-            </w:r>
+              <w:ind w:left="-108" w:right="120"/>
+              <w:jc w:val="right"/>
+              <w:rPr>
+                <w:rFonts w:ascii="Arial" w:hAnsi="Arial" w:cs="Arial"/>
+                <w:sz w:val="14"/>
+                <w:szCs w:val="14"/>
+              </w:rPr>
+            </w:pPr>
             <w:proofErr w:type="spellStart"/>
             <w:r>
               <w:rPr>

</xml_diff>